<commit_message>
Identificacion de personas o animales: Ciudadano, Voluntario/Veterinario y Administrador
</commit_message>
<xml_diff>
--- a/Meza_Jasef_Actividad1.docx
+++ b/Meza_Jasef_Actividad1.docx
@@ -237,12 +237,14 @@
         <w:rPr>
           <w:b/>
           <w:bCs/>
+          <w:lang w:val="es-419"/>
         </w:rPr>
       </w:pPr>
       <w:r>
         <w:rPr>
           <w:b/>
           <w:bCs/>
+          <w:lang w:val="es-419"/>
         </w:rPr>
         <w:t xml:space="preserve">ENLACE A </w:t>
       </w:r>
@@ -250,6 +252,7 @@
         <w:rPr>
           <w:b/>
           <w:bCs/>
+          <w:lang w:val="es-419"/>
         </w:rPr>
         <w:t>GITHUB</w:t>
       </w:r>
@@ -257,6 +260,7 @@
         <w:rPr>
           <w:b/>
           <w:bCs/>
+          <w:lang w:val="es-419"/>
         </w:rPr>
         <w:t>:</w:t>
       </w:r>
@@ -265,6 +269,9 @@
       <w:pPr>
         <w:spacing w:after="200"/>
         <w:jc w:val="center"/>
+        <w:rPr>
+          <w:lang w:val="es-419"/>
+        </w:rPr>
       </w:pPr>
     </w:p>
     <w:p>
@@ -427,16 +434,680 @@
     <w:p>
       <w:pPr>
         <w:rPr>
-          <w:lang w:val="es-419"/>
-        </w:rPr>
-      </w:pPr>
-      <w:r>
-        <w:rPr>
+          <w:b/>
+          <w:bCs/>
+          <w:lang w:val="es-419"/>
+        </w:rPr>
+      </w:pPr>
+      <w:r>
+        <w:rPr>
+          <w:b/>
+          <w:bCs/>
           <w:lang w:val="es-419"/>
         </w:rPr>
         <w:lastRenderedPageBreak/>
-        <w:t>INTRODUCCION</w:t>
-      </w:r>
+        <w:t>PRIMEROS PROCESOS</w:t>
+      </w:r>
+    </w:p>
+    <w:p>
+      <w:pPr>
+        <w:rPr>
+          <w:lang w:val="es-419"/>
+        </w:rPr>
+      </w:pPr>
+      <w:r>
+        <w:rPr>
+          <w:lang w:val="es-419"/>
+        </w:rPr>
+        <w:t>No pude enseñar el proceso principal que se hace para hacer la conexión que solo se realiza una en la computadora donde se realice la actividad, pero lo realice como se debe igual pondré como puse</w:t>
+      </w:r>
+    </w:p>
+    <w:p>
+      <w:pPr>
+        <w:rPr>
+          <w:lang w:val="es-419"/>
+        </w:rPr>
+      </w:pPr>
+      <w:proofErr w:type="spellStart"/>
+      <w:r>
+        <w:rPr>
+          <w:lang w:val="es-419"/>
+        </w:rPr>
+        <w:t>git</w:t>
+      </w:r>
+      <w:proofErr w:type="spellEnd"/>
+      <w:r>
+        <w:rPr>
+          <w:lang w:val="es-419"/>
+        </w:rPr>
+        <w:t xml:space="preserve"> </w:t>
+      </w:r>
+      <w:proofErr w:type="spellStart"/>
+      <w:r>
+        <w:rPr>
+          <w:lang w:val="es-419"/>
+        </w:rPr>
+        <w:t>config</w:t>
+      </w:r>
+      <w:proofErr w:type="spellEnd"/>
+      <w:r>
+        <w:rPr>
+          <w:lang w:val="es-419"/>
+        </w:rPr>
+        <w:t xml:space="preserve"> –global user.name “Jasef Nicolas Meza Ceval</w:t>
+      </w:r>
+      <w:r>
+        <w:rPr>
+          <w:lang w:val="es-419"/>
+        </w:rPr>
+        <w:t>los”</w:t>
+      </w:r>
+    </w:p>
+    <w:p>
+      <w:r>
+        <w:t xml:space="preserve">git config –global </w:t>
+      </w:r>
+      <w:proofErr w:type="spellStart"/>
+      <w:proofErr w:type="gramStart"/>
+      <w:r>
+        <w:t>user.m</w:t>
+      </w:r>
+      <w:r>
+        <w:t>ail</w:t>
+      </w:r>
+      <w:proofErr w:type="spellEnd"/>
+      <w:proofErr w:type="gramEnd"/>
+      <w:r>
+        <w:t xml:space="preserve"> “</w:t>
+      </w:r>
+      <w:hyperlink r:id="rId9" w:history="1">
+        <w:r>
+          <w:rPr>
+            <w:rStyle w:val="Hipervnculo"/>
+          </w:rPr>
+          <w:t>jmeza8115@utm.edu.ec</w:t>
+        </w:r>
+      </w:hyperlink>
+      <w:r>
+        <w:t>”</w:t>
+      </w:r>
+    </w:p>
+    <w:p>
+      <w:pPr>
+        <w:rPr>
+          <w:lang w:val="es-419"/>
+        </w:rPr>
+      </w:pPr>
+      <w:r>
+        <w:rPr>
+          <w:lang w:val="es-419"/>
+        </w:rPr>
+        <w:t>También tuve otro error q</w:t>
+      </w:r>
+      <w:r>
+        <w:rPr>
+          <w:lang w:val="es-419"/>
+        </w:rPr>
+        <w:t xml:space="preserve">ue tuve que apoyarme un poco con la IA ya que no se me reflejaba como el profesor explico </w:t>
+      </w:r>
+      <w:proofErr w:type="spellStart"/>
+      <w:r>
+        <w:rPr>
+          <w:lang w:val="es-419"/>
+        </w:rPr>
+        <w:t>asi</w:t>
+      </w:r>
+      <w:proofErr w:type="spellEnd"/>
+      <w:r>
+        <w:rPr>
+          <w:lang w:val="es-419"/>
+        </w:rPr>
+        <w:t xml:space="preserve"> que me apoye mas no realice las conexiones con ninguna IA.</w:t>
+      </w:r>
+    </w:p>
+    <w:p>
+      <w:pPr>
+        <w:rPr>
+          <w:lang w:val="es-419"/>
+        </w:rPr>
+      </w:pPr>
+      <w:r>
+        <w:rPr>
+          <w:lang w:val="es-419"/>
+        </w:rPr>
+        <w:drawing>
+          <wp:inline distT="0" distB="0" distL="0" distR="0" wp14:anchorId="6A11E13F" wp14:editId="4AFB1643">
+            <wp:extent cx="5696243" cy="3740342"/>
+            <wp:effectExtent l="0" t="0" r="0" b="0"/>
+            <wp:docPr id="2" name="Imagen 2"/>
+            <wp:cNvGraphicFramePr>
+              <a:graphicFrameLocks xmlns:a="http://schemas.openxmlformats.org/drawingml/2006/main" noChangeAspect="1"/>
+            </wp:cNvGraphicFramePr>
+            <a:graphic xmlns:a="http://schemas.openxmlformats.org/drawingml/2006/main">
+              <a:graphicData uri="http://schemas.openxmlformats.org/drawingml/2006/picture">
+                <pic:pic xmlns:pic="http://schemas.openxmlformats.org/drawingml/2006/picture">
+                  <pic:nvPicPr>
+                    <pic:cNvPr id="1" name=""/>
+                    <pic:cNvPicPr/>
+                  </pic:nvPicPr>
+                  <pic:blipFill>
+                    <a:blip r:embed="rId10"/>
+                    <a:stretch>
+                      <a:fillRect/>
+                    </a:stretch>
+                  </pic:blipFill>
+                  <pic:spPr>
+                    <a:xfrm>
+                      <a:off x="0" y="0"/>
+                      <a:ext cx="5696243" cy="3740342"/>
+                    </a:xfrm>
+                    <a:prstGeom prst="rect">
+                      <a:avLst/>
+                    </a:prstGeom>
+                  </pic:spPr>
+                </pic:pic>
+              </a:graphicData>
+            </a:graphic>
+          </wp:inline>
+        </w:drawing>
+      </w:r>
+    </w:p>
+    <w:p>
+      <w:pPr>
+        <w:rPr>
+          <w:lang w:val="es-419"/>
+        </w:rPr>
+      </w:pPr>
+      <w:r>
+        <w:rPr>
+          <w:lang w:val="es-419"/>
+        </w:rPr>
+        <w:t xml:space="preserve">Aquí </w:t>
+      </w:r>
+      <w:r>
+        <w:rPr>
+          <w:lang w:val="es-419"/>
+        </w:rPr>
+        <w:t>realicé</w:t>
+      </w:r>
+      <w:r>
+        <w:rPr>
+          <w:lang w:val="es-419"/>
+        </w:rPr>
+        <w:t xml:space="preserve"> la conexión de manera correcta ya que me </w:t>
+      </w:r>
+      <w:proofErr w:type="spellStart"/>
+      <w:r>
+        <w:rPr>
+          <w:lang w:val="es-419"/>
+        </w:rPr>
+        <w:t>salia</w:t>
+      </w:r>
+      <w:proofErr w:type="spellEnd"/>
+      <w:r>
+        <w:rPr>
+          <w:lang w:val="es-419"/>
+        </w:rPr>
+        <w:t xml:space="preserve"> un error que no me </w:t>
+      </w:r>
+      <w:proofErr w:type="spellStart"/>
+      <w:r>
+        <w:rPr>
+          <w:lang w:val="es-419"/>
+        </w:rPr>
+        <w:t>permitia</w:t>
+      </w:r>
+      <w:proofErr w:type="spellEnd"/>
+      <w:r>
+        <w:rPr>
+          <w:lang w:val="es-419"/>
+        </w:rPr>
+        <w:t xml:space="preserve"> agregar información ya que no había un Word antes y tuve que apoyarme con los documentos para corregir ese error y ahora en el </w:t>
+      </w:r>
+      <w:proofErr w:type="spellStart"/>
+      <w:r>
+        <w:rPr>
+          <w:lang w:val="es-419"/>
+        </w:rPr>
+        <w:t>github</w:t>
+      </w:r>
+      <w:proofErr w:type="spellEnd"/>
+      <w:r>
+        <w:rPr>
+          <w:lang w:val="es-419"/>
+        </w:rPr>
+        <w:t xml:space="preserve"> si se realizan los cambios</w:t>
+      </w:r>
+      <w:r>
+        <w:rPr>
+          <w:lang w:val="es-419"/>
+        </w:rPr>
+        <w:t>.</w:t>
+      </w:r>
+    </w:p>
+    <w:p>
+      <w:pPr>
+        <w:rPr>
+          <w:lang w:val="es-419"/>
+        </w:rPr>
+      </w:pPr>
+      <w:r>
+        <w:rPr>
+          <w:lang w:val="es-419"/>
+        </w:rPr>
+        <w:lastRenderedPageBreak/>
+        <w:drawing>
+          <wp:inline distT="0" distB="0" distL="0" distR="0" wp14:anchorId="0A3ACC92" wp14:editId="7AE12674">
+            <wp:extent cx="5943600" cy="3475355"/>
+            <wp:effectExtent l="0" t="0" r="0" b="0"/>
+            <wp:docPr id="3" name="Imagen 3"/>
+            <wp:cNvGraphicFramePr>
+              <a:graphicFrameLocks xmlns:a="http://schemas.openxmlformats.org/drawingml/2006/main" noChangeAspect="1"/>
+            </wp:cNvGraphicFramePr>
+            <a:graphic xmlns:a="http://schemas.openxmlformats.org/drawingml/2006/main">
+              <a:graphicData uri="http://schemas.openxmlformats.org/drawingml/2006/picture">
+                <pic:pic xmlns:pic="http://schemas.openxmlformats.org/drawingml/2006/picture">
+                  <pic:nvPicPr>
+                    <pic:cNvPr id="1" name=""/>
+                    <pic:cNvPicPr/>
+                  </pic:nvPicPr>
+                  <pic:blipFill>
+                    <a:blip r:embed="rId11"/>
+                    <a:stretch>
+                      <a:fillRect/>
+                    </a:stretch>
+                  </pic:blipFill>
+                  <pic:spPr>
+                    <a:xfrm>
+                      <a:off x="0" y="0"/>
+                      <a:ext cx="5943600" cy="3475355"/>
+                    </a:xfrm>
+                    <a:prstGeom prst="rect">
+                      <a:avLst/>
+                    </a:prstGeom>
+                  </pic:spPr>
+                </pic:pic>
+              </a:graphicData>
+            </a:graphic>
+          </wp:inline>
+        </w:drawing>
+      </w:r>
+    </w:p>
+    <w:p>
+      <w:pPr>
+        <w:rPr>
+          <w:b/>
+          <w:bCs/>
+          <w:lang w:val="es-419"/>
+        </w:rPr>
+      </w:pPr>
+      <w:r>
+        <w:rPr>
+          <w:b/>
+          <w:bCs/>
+          <w:lang w:val="es-419"/>
+        </w:rPr>
+        <w:t>REALIZACION DE ACTIVIDAD CON GITFLOW</w:t>
+      </w:r>
+    </w:p>
+    <w:p>
+      <w:pPr>
+        <w:rPr>
+          <w:lang w:val="es-419"/>
+        </w:rPr>
+      </w:pPr>
+      <w:r>
+        <w:rPr>
+          <w:lang w:val="es-419"/>
+        </w:rPr>
+        <w:t xml:space="preserve">Aquí si tuve que investigar ya </w:t>
+      </w:r>
+      <w:proofErr w:type="gramStart"/>
+      <w:r>
+        <w:rPr>
+          <w:lang w:val="es-419"/>
+        </w:rPr>
+        <w:t>que</w:t>
+      </w:r>
+      <w:proofErr w:type="gramEnd"/>
+      <w:r>
+        <w:rPr>
+          <w:lang w:val="es-419"/>
+        </w:rPr>
+        <w:t xml:space="preserve"> aunque el profesor explico </w:t>
+      </w:r>
+      <w:r>
+        <w:rPr>
+          <w:lang w:val="es-419"/>
+        </w:rPr>
+        <w:t xml:space="preserve">la teoría pero no el </w:t>
+      </w:r>
+      <w:proofErr w:type="spellStart"/>
+      <w:r>
+        <w:rPr>
+          <w:lang w:val="es-419"/>
+        </w:rPr>
+        <w:t>como</w:t>
+      </w:r>
+      <w:proofErr w:type="spellEnd"/>
+      <w:r>
+        <w:rPr>
+          <w:lang w:val="es-419"/>
+        </w:rPr>
+        <w:t xml:space="preserve"> hacerlo en </w:t>
+      </w:r>
+      <w:proofErr w:type="spellStart"/>
+      <w:r>
+        <w:rPr>
+          <w:lang w:val="es-419"/>
+        </w:rPr>
+        <w:t>Github</w:t>
+      </w:r>
+      <w:proofErr w:type="spellEnd"/>
+      <w:r>
+        <w:rPr>
+          <w:lang w:val="es-419"/>
+        </w:rPr>
+        <w:t xml:space="preserve"> al momento que estoy escribiendo este documento</w:t>
+      </w:r>
+    </w:p>
+    <w:p>
+      <w:pPr>
+        <w:rPr>
+          <w:lang w:val="es-419"/>
+        </w:rPr>
+      </w:pPr>
+      <w:r>
+        <w:rPr>
+          <w:lang w:val="es-419"/>
+        </w:rPr>
+        <w:drawing>
+          <wp:inline distT="0" distB="0" distL="0" distR="0" wp14:anchorId="105AF8A0" wp14:editId="4F5877E7">
+            <wp:extent cx="5943600" cy="3264535"/>
+            <wp:effectExtent l="0" t="0" r="0" b="0"/>
+            <wp:docPr id="4" name="Imagen 4"/>
+            <wp:cNvGraphicFramePr>
+              <a:graphicFrameLocks xmlns:a="http://schemas.openxmlformats.org/drawingml/2006/main" noChangeAspect="1"/>
+            </wp:cNvGraphicFramePr>
+            <a:graphic xmlns:a="http://schemas.openxmlformats.org/drawingml/2006/main">
+              <a:graphicData uri="http://schemas.openxmlformats.org/drawingml/2006/picture">
+                <pic:pic xmlns:pic="http://schemas.openxmlformats.org/drawingml/2006/picture">
+                  <pic:nvPicPr>
+                    <pic:cNvPr id="1" name=""/>
+                    <pic:cNvPicPr/>
+                  </pic:nvPicPr>
+                  <pic:blipFill>
+                    <a:blip r:embed="rId12"/>
+                    <a:stretch>
+                      <a:fillRect/>
+                    </a:stretch>
+                  </pic:blipFill>
+                  <pic:spPr>
+                    <a:xfrm>
+                      <a:off x="0" y="0"/>
+                      <a:ext cx="5943600" cy="3264535"/>
+                    </a:xfrm>
+                    <a:prstGeom prst="rect">
+                      <a:avLst/>
+                    </a:prstGeom>
+                  </pic:spPr>
+                </pic:pic>
+              </a:graphicData>
+            </a:graphic>
+          </wp:inline>
+        </w:drawing>
+      </w:r>
+    </w:p>
+    <w:p>
+      <w:pPr>
+        <w:rPr>
+          <w:lang w:val="es-419"/>
+        </w:rPr>
+      </w:pPr>
+      <w:r>
+        <w:rPr>
+          <w:lang w:val="es-419"/>
+        </w:rPr>
+        <w:t xml:space="preserve">Esta pagina me ayudo mucho a realizar la actividad de manera correcta y guiarme mucho la verdad igual lo pondré en la </w:t>
+      </w:r>
+      <w:proofErr w:type="gramStart"/>
+      <w:r>
+        <w:rPr>
+          <w:lang w:val="es-419"/>
+        </w:rPr>
+        <w:t>bibliografía</w:t>
+      </w:r>
+      <w:proofErr w:type="gramEnd"/>
+      <w:r>
+        <w:rPr>
+          <w:lang w:val="es-419"/>
+        </w:rPr>
+        <w:t xml:space="preserve"> pero me ayudo a entender que poner en la app de Git.</w:t>
+      </w:r>
+    </w:p>
+    <w:p>
+      <w:pPr>
+        <w:rPr>
+          <w:lang w:val="es-419"/>
+        </w:rPr>
+      </w:pPr>
+      <w:r>
+        <w:rPr>
+          <w:lang w:val="es-419"/>
+        </w:rPr>
+        <w:lastRenderedPageBreak/>
+        <w:drawing>
+          <wp:inline distT="0" distB="0" distL="0" distR="0" wp14:anchorId="1777CC6E" wp14:editId="6DD1AD81">
+            <wp:extent cx="5943600" cy="2971800"/>
+            <wp:effectExtent l="0" t="0" r="0" b="0"/>
+            <wp:docPr id="5" name="Imagen 5"/>
+            <wp:cNvGraphicFramePr>
+              <a:graphicFrameLocks xmlns:a="http://schemas.openxmlformats.org/drawingml/2006/main" noChangeAspect="1"/>
+            </wp:cNvGraphicFramePr>
+            <a:graphic xmlns:a="http://schemas.openxmlformats.org/drawingml/2006/main">
+              <a:graphicData uri="http://schemas.openxmlformats.org/drawingml/2006/picture">
+                <pic:pic xmlns:pic="http://schemas.openxmlformats.org/drawingml/2006/picture">
+                  <pic:nvPicPr>
+                    <pic:cNvPr id="1" name=""/>
+                    <pic:cNvPicPr/>
+                  </pic:nvPicPr>
+                  <pic:blipFill>
+                    <a:blip r:embed="rId13"/>
+                    <a:stretch>
+                      <a:fillRect/>
+                    </a:stretch>
+                  </pic:blipFill>
+                  <pic:spPr>
+                    <a:xfrm>
+                      <a:off x="0" y="0"/>
+                      <a:ext cx="5943600" cy="2971800"/>
+                    </a:xfrm>
+                    <a:prstGeom prst="rect">
+                      <a:avLst/>
+                    </a:prstGeom>
+                  </pic:spPr>
+                </pic:pic>
+              </a:graphicData>
+            </a:graphic>
+          </wp:inline>
+        </w:drawing>
+      </w:r>
+    </w:p>
+    <w:p>
+      <w:pPr>
+        <w:rPr>
+          <w:lang w:val="es-419"/>
+        </w:rPr>
+      </w:pPr>
+      <w:r>
+        <w:rPr>
+          <w:lang w:val="es-419"/>
+        </w:rPr>
+        <w:t xml:space="preserve">Aquí pude crear de manera correcta </w:t>
+      </w:r>
+      <w:r>
+        <w:rPr>
+          <w:lang w:val="es-419"/>
+        </w:rPr>
+        <w:t xml:space="preserve">una estructura como pide la actividad y ahora en el </w:t>
+      </w:r>
+      <w:proofErr w:type="spellStart"/>
+      <w:r>
+        <w:rPr>
+          <w:lang w:val="es-419"/>
+        </w:rPr>
+        <w:t>Github</w:t>
+      </w:r>
+      <w:proofErr w:type="spellEnd"/>
+      <w:r>
+        <w:rPr>
+          <w:lang w:val="es-419"/>
+        </w:rPr>
+        <w:t xml:space="preserve"> tengo un </w:t>
+      </w:r>
+      <w:proofErr w:type="spellStart"/>
+      <w:r>
+        <w:rPr>
+          <w:lang w:val="es-419"/>
+        </w:rPr>
+        <w:t>main</w:t>
+      </w:r>
+      <w:proofErr w:type="spellEnd"/>
+      <w:r>
+        <w:rPr>
+          <w:lang w:val="es-419"/>
+        </w:rPr>
+        <w:t xml:space="preserve"> y un master como lo pide ahora continuaremos con el siguiente paso:</w:t>
+      </w:r>
+    </w:p>
+    <w:p>
+      <w:pPr>
+        <w:rPr>
+          <w:lang w:val="es-419"/>
+        </w:rPr>
+      </w:pPr>
+      <w:r>
+        <w:rPr>
+          <w:lang w:val="es-419"/>
+        </w:rPr>
+        <w:drawing>
+          <wp:inline distT="0" distB="0" distL="0" distR="0" wp14:anchorId="461F9891" wp14:editId="13599392">
+            <wp:extent cx="5943600" cy="2778760"/>
+            <wp:effectExtent l="0" t="0" r="0" b="0"/>
+            <wp:docPr id="6" name="Imagen 6"/>
+            <wp:cNvGraphicFramePr>
+              <a:graphicFrameLocks xmlns:a="http://schemas.openxmlformats.org/drawingml/2006/main" noChangeAspect="1"/>
+            </wp:cNvGraphicFramePr>
+            <a:graphic xmlns:a="http://schemas.openxmlformats.org/drawingml/2006/main">
+              <a:graphicData uri="http://schemas.openxmlformats.org/drawingml/2006/picture">
+                <pic:pic xmlns:pic="http://schemas.openxmlformats.org/drawingml/2006/picture">
+                  <pic:nvPicPr>
+                    <pic:cNvPr id="1" name=""/>
+                    <pic:cNvPicPr/>
+                  </pic:nvPicPr>
+                  <pic:blipFill>
+                    <a:blip r:embed="rId14"/>
+                    <a:stretch>
+                      <a:fillRect/>
+                    </a:stretch>
+                  </pic:blipFill>
+                  <pic:spPr>
+                    <a:xfrm>
+                      <a:off x="0" y="0"/>
+                      <a:ext cx="5943600" cy="2778760"/>
+                    </a:xfrm>
+                    <a:prstGeom prst="rect">
+                      <a:avLst/>
+                    </a:prstGeom>
+                  </pic:spPr>
+                </pic:pic>
+              </a:graphicData>
+            </a:graphic>
+          </wp:inline>
+        </w:drawing>
+      </w:r>
+    </w:p>
+    <w:p>
+      <w:pPr>
+        <w:rPr>
+          <w:lang w:val="es-419"/>
+        </w:rPr>
+      </w:pPr>
+      <w:r>
+        <w:rPr>
+          <w:lang w:val="es-419"/>
+        </w:rPr>
+        <w:drawing>
+          <wp:inline distT="0" distB="0" distL="0" distR="0" wp14:anchorId="14148729" wp14:editId="7291E95D">
+            <wp:extent cx="4819898" cy="1428823"/>
+            <wp:effectExtent l="0" t="0" r="0" b="0"/>
+            <wp:docPr id="7" name="Imagen 7"/>
+            <wp:cNvGraphicFramePr>
+              <a:graphicFrameLocks xmlns:a="http://schemas.openxmlformats.org/drawingml/2006/main" noChangeAspect="1"/>
+            </wp:cNvGraphicFramePr>
+            <a:graphic xmlns:a="http://schemas.openxmlformats.org/drawingml/2006/main">
+              <a:graphicData uri="http://schemas.openxmlformats.org/drawingml/2006/picture">
+                <pic:pic xmlns:pic="http://schemas.openxmlformats.org/drawingml/2006/picture">
+                  <pic:nvPicPr>
+                    <pic:cNvPr id="1" name=""/>
+                    <pic:cNvPicPr/>
+                  </pic:nvPicPr>
+                  <pic:blipFill>
+                    <a:blip r:embed="rId15"/>
+                    <a:stretch>
+                      <a:fillRect/>
+                    </a:stretch>
+                  </pic:blipFill>
+                  <pic:spPr>
+                    <a:xfrm>
+                      <a:off x="0" y="0"/>
+                      <a:ext cx="4819898" cy="1428823"/>
+                    </a:xfrm>
+                    <a:prstGeom prst="rect">
+                      <a:avLst/>
+                    </a:prstGeom>
+                  </pic:spPr>
+                </pic:pic>
+              </a:graphicData>
+            </a:graphic>
+          </wp:inline>
+        </w:drawing>
+      </w:r>
+    </w:p>
+    <w:p>
+      <w:pPr>
+        <w:rPr>
+          <w:lang w:val="es-419"/>
+        </w:rPr>
+      </w:pPr>
+      <w:r>
+        <w:rPr>
+          <w:lang w:val="es-419"/>
+        </w:rPr>
+        <w:lastRenderedPageBreak/>
+        <w:t xml:space="preserve">Aquí como se puede ver realizamos la eliminación de </w:t>
+      </w:r>
+      <w:proofErr w:type="spellStart"/>
+      <w:r>
+        <w:rPr>
+          <w:lang w:val="es-419"/>
+        </w:rPr>
+        <w:t>main</w:t>
+      </w:r>
+      <w:proofErr w:type="spellEnd"/>
+      <w:r>
+        <w:rPr>
+          <w:lang w:val="es-419"/>
+        </w:rPr>
+        <w:t xml:space="preserve"> para cambiarlo por el master y todos los cambios se hicieron de manera correcta y sin errores.</w:t>
+      </w:r>
+    </w:p>
+    <w:p>
+      <w:pPr>
+        <w:rPr>
+          <w:lang w:val="es-419"/>
+        </w:rPr>
+      </w:pPr>
     </w:p>
     <w:sectPr>
       <w:pgSz w:w="12240" w:h="15840"/>

</xml_diff>

<commit_message>
Descripcion y ajustes correspondientes del diagrama de casos de uso
</commit_message>
<xml_diff>
--- a/Meza_Jasef_Actividad1.docx
+++ b/Meza_Jasef_Actividad1.docx
@@ -468,33 +468,11 @@
           <w:lang w:val="es-419"/>
         </w:rPr>
       </w:pPr>
-      <w:proofErr w:type="spellStart"/>
-      <w:r>
-        <w:rPr>
-          <w:lang w:val="es-419"/>
-        </w:rPr>
-        <w:t>git</w:t>
-      </w:r>
-      <w:proofErr w:type="spellEnd"/>
-      <w:r>
-        <w:rPr>
-          <w:lang w:val="es-419"/>
-        </w:rPr>
-        <w:t xml:space="preserve"> </w:t>
-      </w:r>
-      <w:proofErr w:type="spellStart"/>
-      <w:r>
-        <w:rPr>
-          <w:lang w:val="es-419"/>
-        </w:rPr>
-        <w:t>config</w:t>
-      </w:r>
-      <w:proofErr w:type="spellEnd"/>
-      <w:r>
-        <w:rPr>
-          <w:lang w:val="es-419"/>
-        </w:rPr>
-        <w:t xml:space="preserve"> –global user.name “Jasef Nicolas Meza Ceval</w:t>
+      <w:r>
+        <w:rPr>
+          <w:lang w:val="es-419"/>
+        </w:rPr>
+        <w:t>git config –global user.name “Jasef Nicolas Meza Ceval</w:t>
       </w:r>
       <w:r>
         <w:rPr>
@@ -505,20 +483,10 @@
     </w:p>
     <w:p>
       <w:r>
-        <w:t xml:space="preserve">git config –global </w:t>
-      </w:r>
-      <w:proofErr w:type="spellStart"/>
-      <w:proofErr w:type="gramStart"/>
-      <w:r>
-        <w:t>user.m</w:t>
-      </w:r>
-      <w:r>
-        <w:t>ail</w:t>
-      </w:r>
-      <w:proofErr w:type="spellEnd"/>
-      <w:proofErr w:type="gramEnd"/>
-      <w:r>
-        <w:t xml:space="preserve"> “</w:t>
+        <w:t>git config –global user.m</w:t>
+      </w:r>
+      <w:r>
+        <w:t>ail “</w:t>
       </w:r>
       <w:hyperlink r:id="rId9" w:history="1">
         <w:r>
@@ -548,31 +516,18 @@
         <w:rPr>
           <w:lang w:val="es-419"/>
         </w:rPr>
-        <w:t xml:space="preserve">ue tuve que apoyarme un poco con la IA ya que no se me reflejaba como el profesor explico </w:t>
-      </w:r>
-      <w:proofErr w:type="spellStart"/>
-      <w:r>
-        <w:rPr>
-          <w:lang w:val="es-419"/>
-        </w:rPr>
-        <w:t>asi</w:t>
-      </w:r>
-      <w:proofErr w:type="spellEnd"/>
-      <w:r>
-        <w:rPr>
-          <w:lang w:val="es-419"/>
-        </w:rPr>
-        <w:t xml:space="preserve"> que me apoye mas no realice las conexiones con ninguna IA.</w:t>
-      </w:r>
-    </w:p>
-    <w:p>
-      <w:pPr>
-        <w:rPr>
-          <w:lang w:val="es-419"/>
-        </w:rPr>
-      </w:pPr>
-      <w:r>
-        <w:rPr>
+        <w:t>ue tuve que apoyarme un poco con la IA ya que no se me reflejaba como el profesor explico asi que me apoye mas no realice las conexiones con ninguna IA.</w:t>
+      </w:r>
+    </w:p>
+    <w:p>
+      <w:pPr>
+        <w:rPr>
+          <w:lang w:val="es-419"/>
+        </w:rPr>
+      </w:pPr>
+      <w:r>
+        <w:rPr>
+          <w:noProof/>
           <w:lang w:val="es-419"/>
         </w:rPr>
         <w:drawing>
@@ -634,49 +589,7 @@
         <w:rPr>
           <w:lang w:val="es-419"/>
         </w:rPr>
-        <w:t xml:space="preserve"> la conexión de manera correcta ya que me </w:t>
-      </w:r>
-      <w:proofErr w:type="spellStart"/>
-      <w:r>
-        <w:rPr>
-          <w:lang w:val="es-419"/>
-        </w:rPr>
-        <w:t>salia</w:t>
-      </w:r>
-      <w:proofErr w:type="spellEnd"/>
-      <w:r>
-        <w:rPr>
-          <w:lang w:val="es-419"/>
-        </w:rPr>
-        <w:t xml:space="preserve"> un error que no me </w:t>
-      </w:r>
-      <w:proofErr w:type="spellStart"/>
-      <w:r>
-        <w:rPr>
-          <w:lang w:val="es-419"/>
-        </w:rPr>
-        <w:t>permitia</w:t>
-      </w:r>
-      <w:proofErr w:type="spellEnd"/>
-      <w:r>
-        <w:rPr>
-          <w:lang w:val="es-419"/>
-        </w:rPr>
-        <w:t xml:space="preserve"> agregar información ya que no había un Word antes y tuve que apoyarme con los documentos para corregir ese error y ahora en el </w:t>
-      </w:r>
-      <w:proofErr w:type="spellStart"/>
-      <w:r>
-        <w:rPr>
-          <w:lang w:val="es-419"/>
-        </w:rPr>
-        <w:t>github</w:t>
-      </w:r>
-      <w:proofErr w:type="spellEnd"/>
-      <w:r>
-        <w:rPr>
-          <w:lang w:val="es-419"/>
-        </w:rPr>
-        <w:t xml:space="preserve"> si se realizan los cambios</w:t>
+        <w:t xml:space="preserve"> la conexión de manera correcta ya que me salia un error que no me permitia agregar información ya que no había un Word antes y tuve que apoyarme con los documentos para corregir ese error y ahora en el github si se realizan los cambios</w:t>
       </w:r>
       <w:r>
         <w:rPr>
@@ -693,6 +606,7 @@
       </w:pPr>
       <w:r>
         <w:rPr>
+          <w:noProof/>
           <w:lang w:val="es-419"/>
         </w:rPr>
         <w:lastRenderedPageBreak/>
@@ -760,65 +674,24 @@
         <w:rPr>
           <w:lang w:val="es-419"/>
         </w:rPr>
-        <w:t xml:space="preserve">Aquí si tuve que investigar ya </w:t>
-      </w:r>
-      <w:proofErr w:type="gramStart"/>
-      <w:r>
-        <w:rPr>
-          <w:lang w:val="es-419"/>
-        </w:rPr>
-        <w:t>que</w:t>
-      </w:r>
-      <w:proofErr w:type="gramEnd"/>
-      <w:r>
-        <w:rPr>
-          <w:lang w:val="es-419"/>
-        </w:rPr>
-        <w:t xml:space="preserve"> aunque el profesor explico </w:t>
-      </w:r>
-      <w:r>
-        <w:rPr>
-          <w:lang w:val="es-419"/>
-        </w:rPr>
-        <w:t xml:space="preserve">la teoría pero no el </w:t>
-      </w:r>
-      <w:proofErr w:type="spellStart"/>
-      <w:r>
-        <w:rPr>
-          <w:lang w:val="es-419"/>
-        </w:rPr>
-        <w:t>como</w:t>
-      </w:r>
-      <w:proofErr w:type="spellEnd"/>
-      <w:r>
-        <w:rPr>
-          <w:lang w:val="es-419"/>
-        </w:rPr>
-        <w:t xml:space="preserve"> hacerlo en </w:t>
-      </w:r>
-      <w:proofErr w:type="spellStart"/>
-      <w:r>
-        <w:rPr>
-          <w:lang w:val="es-419"/>
-        </w:rPr>
-        <w:t>Github</w:t>
-      </w:r>
-      <w:proofErr w:type="spellEnd"/>
-      <w:r>
-        <w:rPr>
-          <w:lang w:val="es-419"/>
-        </w:rPr>
-        <w:t xml:space="preserve"> al momento que estoy escribiendo este documento</w:t>
-      </w:r>
-    </w:p>
-    <w:p>
-      <w:pPr>
-        <w:rPr>
-          <w:lang w:val="es-419"/>
-        </w:rPr>
-      </w:pPr>
-      <w:r>
-        <w:rPr>
+        <w:t xml:space="preserve">Aquí si tuve que investigar ya que aunque el profesor explico </w:t>
+      </w:r>
+      <w:r>
+        <w:rPr>
+          <w:lang w:val="es-419"/>
+        </w:rPr>
+        <w:t>la teoría pero no el como hacerlo en Github al momento que estoy escribiendo este documento</w:t>
+      </w:r>
+    </w:p>
+    <w:p>
+      <w:pPr>
+        <w:rPr>
+          <w:lang w:val="es-419"/>
+        </w:rPr>
+      </w:pPr>
+      <w:r>
+        <w:rPr>
+          <w:noProof/>
           <w:lang w:val="es-419"/>
         </w:rPr>
         <w:drawing>
@@ -868,31 +741,18 @@
         <w:rPr>
           <w:lang w:val="es-419"/>
         </w:rPr>
-        <w:t xml:space="preserve">Esta pagina me ayudo mucho a realizar la actividad de manera correcta y guiarme mucho la verdad igual lo pondré en la </w:t>
-      </w:r>
-      <w:proofErr w:type="gramStart"/>
-      <w:r>
-        <w:rPr>
-          <w:lang w:val="es-419"/>
-        </w:rPr>
-        <w:t>bibliografía</w:t>
-      </w:r>
-      <w:proofErr w:type="gramEnd"/>
-      <w:r>
-        <w:rPr>
-          <w:lang w:val="es-419"/>
-        </w:rPr>
-        <w:t xml:space="preserve"> pero me ayudo a entender que poner en la app de Git.</w:t>
-      </w:r>
-    </w:p>
-    <w:p>
-      <w:pPr>
-        <w:rPr>
-          <w:lang w:val="es-419"/>
-        </w:rPr>
-      </w:pPr>
-      <w:r>
-        <w:rPr>
+        <w:t>Esta pagina me ayudo mucho a realizar la actividad de manera correcta y guiarme mucho la verdad igual lo pondré en la bibliografía pero me ayudo a entender que poner en la app de Git.</w:t>
+      </w:r>
+    </w:p>
+    <w:p>
+      <w:pPr>
+        <w:rPr>
+          <w:lang w:val="es-419"/>
+        </w:rPr>
+      </w:pPr>
+      <w:r>
+        <w:rPr>
+          <w:noProof/>
           <w:lang w:val="es-419"/>
         </w:rPr>
         <w:lastRenderedPageBreak/>
@@ -949,45 +809,18 @@
         <w:rPr>
           <w:lang w:val="es-419"/>
         </w:rPr>
-        <w:t xml:space="preserve">una estructura como pide la actividad y ahora en el </w:t>
-      </w:r>
-      <w:proofErr w:type="spellStart"/>
-      <w:r>
-        <w:rPr>
-          <w:lang w:val="es-419"/>
-        </w:rPr>
-        <w:t>Github</w:t>
-      </w:r>
-      <w:proofErr w:type="spellEnd"/>
-      <w:r>
-        <w:rPr>
-          <w:lang w:val="es-419"/>
-        </w:rPr>
-        <w:t xml:space="preserve"> tengo un </w:t>
-      </w:r>
-      <w:proofErr w:type="spellStart"/>
-      <w:r>
-        <w:rPr>
-          <w:lang w:val="es-419"/>
-        </w:rPr>
-        <w:t>main</w:t>
-      </w:r>
-      <w:proofErr w:type="spellEnd"/>
-      <w:r>
-        <w:rPr>
-          <w:lang w:val="es-419"/>
-        </w:rPr>
-        <w:t xml:space="preserve"> y un master como lo pide ahora continuaremos con el siguiente paso:</w:t>
-      </w:r>
-    </w:p>
-    <w:p>
-      <w:pPr>
-        <w:rPr>
-          <w:lang w:val="es-419"/>
-        </w:rPr>
-      </w:pPr>
-      <w:r>
-        <w:rPr>
+        <w:t>una estructura como pide la actividad y ahora en el Github tengo un main y un master como lo pide ahora continuaremos con el siguiente paso:</w:t>
+      </w:r>
+    </w:p>
+    <w:p>
+      <w:pPr>
+        <w:rPr>
+          <w:lang w:val="es-419"/>
+        </w:rPr>
+      </w:pPr>
+      <w:r>
+        <w:rPr>
+          <w:noProof/>
           <w:lang w:val="es-419"/>
         </w:rPr>
         <w:drawing>
@@ -1035,6 +868,7 @@
       </w:pPr>
       <w:r>
         <w:rPr>
+          <w:noProof/>
           <w:lang w:val="es-419"/>
         </w:rPr>
         <w:drawing>
@@ -1085,29 +919,21 @@
           <w:lang w:val="es-419"/>
         </w:rPr>
         <w:lastRenderedPageBreak/>
-        <w:t xml:space="preserve">Aquí como se puede ver realizamos la eliminación de </w:t>
-      </w:r>
-      <w:proofErr w:type="spellStart"/>
-      <w:r>
-        <w:rPr>
-          <w:lang w:val="es-419"/>
-        </w:rPr>
-        <w:t>main</w:t>
-      </w:r>
-      <w:proofErr w:type="spellEnd"/>
-      <w:r>
-        <w:rPr>
-          <w:lang w:val="es-419"/>
-        </w:rPr>
-        <w:t xml:space="preserve"> para cambiarlo por el master y todos los cambios se hicieron de manera correcta y sin errores.</w:t>
-      </w:r>
-    </w:p>
-    <w:p>
-      <w:pPr>
-        <w:rPr>
-          <w:lang w:val="es-419"/>
-        </w:rPr>
-      </w:pPr>
+        <w:t>Aquí como se puede ver realizamos la eliminación de main para cambiarlo por el master y todos los cambios se hicieron de manera correcta y sin errores.</w:t>
+      </w:r>
+    </w:p>
+    <w:p>
+      <w:pPr>
+        <w:rPr>
+          <w:lang w:val="es-419"/>
+        </w:rPr>
+      </w:pPr>
+      <w:r>
+        <w:rPr>
+          <w:lang w:val="es-419"/>
+        </w:rPr>
+        <w:t>Diagrama casos usos</w:t>
+      </w:r>
     </w:p>
     <w:sectPr>
       <w:pgSz w:w="12240" w:h="15840"/>

</xml_diff>

<commit_message>
Descripcion del diagrama de clases y aplicacion de lo que pide sobre principios SOLID
</commit_message>
<xml_diff>
--- a/Meza_Jasef_Actividad1.docx
+++ b/Meza_Jasef_Actividad1.docx
@@ -468,11 +468,33 @@
           <w:lang w:val="es-419"/>
         </w:rPr>
       </w:pPr>
-      <w:r>
-        <w:rPr>
-          <w:lang w:val="es-419"/>
-        </w:rPr>
-        <w:t>git config –global user.name “Jasef Nicolas Meza Ceval</w:t>
+      <w:proofErr w:type="spellStart"/>
+      <w:r>
+        <w:rPr>
+          <w:lang w:val="es-419"/>
+        </w:rPr>
+        <w:t>git</w:t>
+      </w:r>
+      <w:proofErr w:type="spellEnd"/>
+      <w:r>
+        <w:rPr>
+          <w:lang w:val="es-419"/>
+        </w:rPr>
+        <w:t xml:space="preserve"> </w:t>
+      </w:r>
+      <w:proofErr w:type="spellStart"/>
+      <w:r>
+        <w:rPr>
+          <w:lang w:val="es-419"/>
+        </w:rPr>
+        <w:t>config</w:t>
+      </w:r>
+      <w:proofErr w:type="spellEnd"/>
+      <w:r>
+        <w:rPr>
+          <w:lang w:val="es-419"/>
+        </w:rPr>
+        <w:t xml:space="preserve"> –global user.name “Jasef Nicolas Meza Ceval</w:t>
       </w:r>
       <w:r>
         <w:rPr>
@@ -483,10 +505,20 @@
     </w:p>
     <w:p>
       <w:r>
-        <w:t>git config –global user.m</w:t>
-      </w:r>
-      <w:r>
-        <w:t>ail “</w:t>
+        <w:t xml:space="preserve">git config –global </w:t>
+      </w:r>
+      <w:proofErr w:type="spellStart"/>
+      <w:proofErr w:type="gramStart"/>
+      <w:r>
+        <w:t>user.m</w:t>
+      </w:r>
+      <w:r>
+        <w:t>ail</w:t>
+      </w:r>
+      <w:proofErr w:type="spellEnd"/>
+      <w:proofErr w:type="gramEnd"/>
+      <w:r>
+        <w:t xml:space="preserve"> “</w:t>
       </w:r>
       <w:hyperlink r:id="rId9" w:history="1">
         <w:r>
@@ -516,7 +548,21 @@
         <w:rPr>
           <w:lang w:val="es-419"/>
         </w:rPr>
-        <w:t>ue tuve que apoyarme un poco con la IA ya que no se me reflejaba como el profesor explico asi que me apoye mas no realice las conexiones con ninguna IA.</w:t>
+        <w:t xml:space="preserve">ue tuve que apoyarme un poco con la IA ya que no se me reflejaba como el profesor explico </w:t>
+      </w:r>
+      <w:proofErr w:type="spellStart"/>
+      <w:r>
+        <w:rPr>
+          <w:lang w:val="es-419"/>
+        </w:rPr>
+        <w:t>asi</w:t>
+      </w:r>
+      <w:proofErr w:type="spellEnd"/>
+      <w:r>
+        <w:rPr>
+          <w:lang w:val="es-419"/>
+        </w:rPr>
+        <w:t xml:space="preserve"> que me apoye mas no realice las conexiones con ninguna IA.</w:t>
       </w:r>
     </w:p>
     <w:p>
@@ -589,7 +635,49 @@
         <w:rPr>
           <w:lang w:val="es-419"/>
         </w:rPr>
-        <w:t xml:space="preserve"> la conexión de manera correcta ya que me salia un error que no me permitia agregar información ya que no había un Word antes y tuve que apoyarme con los documentos para corregir ese error y ahora en el github si se realizan los cambios</w:t>
+        <w:t xml:space="preserve"> la conexión de manera correcta ya que me </w:t>
+      </w:r>
+      <w:proofErr w:type="spellStart"/>
+      <w:r>
+        <w:rPr>
+          <w:lang w:val="es-419"/>
+        </w:rPr>
+        <w:t>salia</w:t>
+      </w:r>
+      <w:proofErr w:type="spellEnd"/>
+      <w:r>
+        <w:rPr>
+          <w:lang w:val="es-419"/>
+        </w:rPr>
+        <w:t xml:space="preserve"> un error que no me </w:t>
+      </w:r>
+      <w:proofErr w:type="spellStart"/>
+      <w:r>
+        <w:rPr>
+          <w:lang w:val="es-419"/>
+        </w:rPr>
+        <w:t>permitia</w:t>
+      </w:r>
+      <w:proofErr w:type="spellEnd"/>
+      <w:r>
+        <w:rPr>
+          <w:lang w:val="es-419"/>
+        </w:rPr>
+        <w:t xml:space="preserve"> agregar información ya que no había un Word antes y tuve que apoyarme con los documentos para corregir ese error y ahora en el </w:t>
+      </w:r>
+      <w:proofErr w:type="spellStart"/>
+      <w:r>
+        <w:rPr>
+          <w:lang w:val="es-419"/>
+        </w:rPr>
+        <w:t>github</w:t>
+      </w:r>
+      <w:proofErr w:type="spellEnd"/>
+      <w:r>
+        <w:rPr>
+          <w:lang w:val="es-419"/>
+        </w:rPr>
+        <w:t xml:space="preserve"> si se realizan los cambios</w:t>
       </w:r>
       <w:r>
         <w:rPr>
@@ -674,13 +762,55 @@
         <w:rPr>
           <w:lang w:val="es-419"/>
         </w:rPr>
-        <w:t xml:space="preserve">Aquí si tuve que investigar ya que aunque el profesor explico </w:t>
-      </w:r>
-      <w:r>
-        <w:rPr>
-          <w:lang w:val="es-419"/>
-        </w:rPr>
-        <w:t>la teoría pero no el como hacerlo en Github al momento que estoy escribiendo este documento</w:t>
+        <w:t xml:space="preserve">Aquí si tuve que investigar ya </w:t>
+      </w:r>
+      <w:proofErr w:type="gramStart"/>
+      <w:r>
+        <w:rPr>
+          <w:lang w:val="es-419"/>
+        </w:rPr>
+        <w:t>que</w:t>
+      </w:r>
+      <w:proofErr w:type="gramEnd"/>
+      <w:r>
+        <w:rPr>
+          <w:lang w:val="es-419"/>
+        </w:rPr>
+        <w:t xml:space="preserve"> aunque el profesor explico </w:t>
+      </w:r>
+      <w:r>
+        <w:rPr>
+          <w:lang w:val="es-419"/>
+        </w:rPr>
+        <w:t xml:space="preserve">la teoría pero no el </w:t>
+      </w:r>
+      <w:proofErr w:type="spellStart"/>
+      <w:r>
+        <w:rPr>
+          <w:lang w:val="es-419"/>
+        </w:rPr>
+        <w:t>como</w:t>
+      </w:r>
+      <w:proofErr w:type="spellEnd"/>
+      <w:r>
+        <w:rPr>
+          <w:lang w:val="es-419"/>
+        </w:rPr>
+        <w:t xml:space="preserve"> hacerlo en </w:t>
+      </w:r>
+      <w:proofErr w:type="spellStart"/>
+      <w:r>
+        <w:rPr>
+          <w:lang w:val="es-419"/>
+        </w:rPr>
+        <w:t>Github</w:t>
+      </w:r>
+      <w:proofErr w:type="spellEnd"/>
+      <w:r>
+        <w:rPr>
+          <w:lang w:val="es-419"/>
+        </w:rPr>
+        <w:t xml:space="preserve"> al momento que estoy escribiendo este documento</w:t>
       </w:r>
     </w:p>
     <w:p>
@@ -741,7 +871,49 @@
         <w:rPr>
           <w:lang w:val="es-419"/>
         </w:rPr>
-        <w:t>Esta pagina me ayudo mucho a realizar la actividad de manera correcta y guiarme mucho la verdad igual lo pondré en la bibliografía pero me ayudo a entender que poner en la app de Git.</w:t>
+        <w:t xml:space="preserve">Esta </w:t>
+      </w:r>
+      <w:proofErr w:type="spellStart"/>
+      <w:r>
+        <w:rPr>
+          <w:lang w:val="es-419"/>
+        </w:rPr>
+        <w:t>pagina</w:t>
+      </w:r>
+      <w:proofErr w:type="spellEnd"/>
+      <w:r>
+        <w:rPr>
+          <w:lang w:val="es-419"/>
+        </w:rPr>
+        <w:t xml:space="preserve"> me </w:t>
+      </w:r>
+      <w:proofErr w:type="spellStart"/>
+      <w:r>
+        <w:rPr>
+          <w:lang w:val="es-419"/>
+        </w:rPr>
+        <w:t>ayudo</w:t>
+      </w:r>
+      <w:proofErr w:type="spellEnd"/>
+      <w:r>
+        <w:rPr>
+          <w:lang w:val="es-419"/>
+        </w:rPr>
+        <w:t xml:space="preserve"> mucho a realizar la actividad de manera correcta y guiarme mucho la verdad igual lo pondré en la </w:t>
+      </w:r>
+      <w:proofErr w:type="gramStart"/>
+      <w:r>
+        <w:rPr>
+          <w:lang w:val="es-419"/>
+        </w:rPr>
+        <w:t>bibliografía</w:t>
+      </w:r>
+      <w:proofErr w:type="gramEnd"/>
+      <w:r>
+        <w:rPr>
+          <w:lang w:val="es-419"/>
+        </w:rPr>
+        <w:t xml:space="preserve"> pero me ayudo a entender que poner en la app de Git.</w:t>
       </w:r>
     </w:p>
     <w:p>
@@ -809,7 +981,35 @@
         <w:rPr>
           <w:lang w:val="es-419"/>
         </w:rPr>
-        <w:t>una estructura como pide la actividad y ahora en el Github tengo un main y un master como lo pide ahora continuaremos con el siguiente paso:</w:t>
+        <w:t xml:space="preserve">una estructura como pide la actividad y ahora en el </w:t>
+      </w:r>
+      <w:proofErr w:type="spellStart"/>
+      <w:r>
+        <w:rPr>
+          <w:lang w:val="es-419"/>
+        </w:rPr>
+        <w:t>Github</w:t>
+      </w:r>
+      <w:proofErr w:type="spellEnd"/>
+      <w:r>
+        <w:rPr>
+          <w:lang w:val="es-419"/>
+        </w:rPr>
+        <w:t xml:space="preserve"> tengo un </w:t>
+      </w:r>
+      <w:proofErr w:type="spellStart"/>
+      <w:r>
+        <w:rPr>
+          <w:lang w:val="es-419"/>
+        </w:rPr>
+        <w:t>main</w:t>
+      </w:r>
+      <w:proofErr w:type="spellEnd"/>
+      <w:r>
+        <w:rPr>
+          <w:lang w:val="es-419"/>
+        </w:rPr>
+        <w:t xml:space="preserve"> y un master como lo pide ahora continuaremos con el siguiente paso:</w:t>
       </w:r>
     </w:p>
     <w:p>
@@ -919,21 +1119,56 @@
           <w:lang w:val="es-419"/>
         </w:rPr>
         <w:lastRenderedPageBreak/>
-        <w:t>Aquí como se puede ver realizamos la eliminación de main para cambiarlo por el master y todos los cambios se hicieron de manera correcta y sin errores.</w:t>
-      </w:r>
-    </w:p>
-    <w:p>
-      <w:pPr>
-        <w:rPr>
-          <w:lang w:val="es-419"/>
-        </w:rPr>
-      </w:pPr>
-      <w:r>
-        <w:rPr>
-          <w:lang w:val="es-419"/>
-        </w:rPr>
-        <w:t>Diagrama casos usos</w:t>
-      </w:r>
+        <w:t xml:space="preserve">Aquí como se puede ver realizamos la eliminación de </w:t>
+      </w:r>
+      <w:proofErr w:type="spellStart"/>
+      <w:r>
+        <w:rPr>
+          <w:lang w:val="es-419"/>
+        </w:rPr>
+        <w:t>main</w:t>
+      </w:r>
+      <w:proofErr w:type="spellEnd"/>
+      <w:r>
+        <w:rPr>
+          <w:lang w:val="es-419"/>
+        </w:rPr>
+        <w:t xml:space="preserve"> para cambiarlo por el master y todos los cambios se hicieron de manera correcta y sin errores.</w:t>
+      </w:r>
+    </w:p>
+    <w:p>
+      <w:pPr>
+        <w:rPr>
+          <w:b/>
+          <w:bCs/>
+          <w:lang w:val="es-419"/>
+        </w:rPr>
+      </w:pPr>
+      <w:r>
+        <w:rPr>
+          <w:b/>
+          <w:bCs/>
+          <w:lang w:val="es-419"/>
+        </w:rPr>
+        <w:t xml:space="preserve">Diagrama </w:t>
+      </w:r>
+      <w:r>
+        <w:rPr>
+          <w:b/>
+          <w:bCs/>
+          <w:lang w:val="es-419"/>
+        </w:rPr>
+        <w:t>de clases</w:t>
+      </w:r>
+    </w:p>
+    <w:p>
+      <w:pPr>
+        <w:rPr>
+          <w:b/>
+          <w:bCs/>
+          <w:lang w:val="es-419"/>
+        </w:rPr>
+      </w:pPr>
     </w:p>
     <w:sectPr>
       <w:pgSz w:w="12240" w:h="15840"/>

</xml_diff>

<commit_message>
Aqui asignamos la arquitectura general integrando el flujo de versiones
</commit_message>
<xml_diff>
--- a/Meza_Jasef_Actividad1.docx
+++ b/Meza_Jasef_Actividad1.docx
@@ -508,7 +508,6 @@
         <w:t xml:space="preserve">git config –global </w:t>
       </w:r>
       <w:proofErr w:type="spellStart"/>
-      <w:proofErr w:type="gramStart"/>
       <w:r>
         <w:t>user.m</w:t>
       </w:r>
@@ -516,7 +515,6 @@
         <w:t>ail</w:t>
       </w:r>
       <w:proofErr w:type="spellEnd"/>
-      <w:proofErr w:type="gramEnd"/>
       <w:r>
         <w:t xml:space="preserve"> “</w:t>
       </w:r>
@@ -762,21 +760,7 @@
         <w:rPr>
           <w:lang w:val="es-419"/>
         </w:rPr>
-        <w:t xml:space="preserve">Aquí si tuve que investigar ya </w:t>
-      </w:r>
-      <w:proofErr w:type="gramStart"/>
-      <w:r>
-        <w:rPr>
-          <w:lang w:val="es-419"/>
-        </w:rPr>
-        <w:t>que</w:t>
-      </w:r>
-      <w:proofErr w:type="gramEnd"/>
-      <w:r>
-        <w:rPr>
-          <w:lang w:val="es-419"/>
-        </w:rPr>
-        <w:t xml:space="preserve"> aunque el profesor explico </w:t>
+        <w:t xml:space="preserve">Aquí si tuve que investigar ya que aunque el profesor explico </w:t>
       </w:r>
       <w:r>
         <w:rPr>
@@ -899,21 +883,7 @@
         <w:rPr>
           <w:lang w:val="es-419"/>
         </w:rPr>
-        <w:t xml:space="preserve"> mucho a realizar la actividad de manera correcta y guiarme mucho la verdad igual lo pondré en la </w:t>
-      </w:r>
-      <w:proofErr w:type="gramStart"/>
-      <w:r>
-        <w:rPr>
-          <w:lang w:val="es-419"/>
-        </w:rPr>
-        <w:t>bibliografía</w:t>
-      </w:r>
-      <w:proofErr w:type="gramEnd"/>
-      <w:r>
-        <w:rPr>
-          <w:lang w:val="es-419"/>
-        </w:rPr>
-        <w:t xml:space="preserve"> pero me ayudo a entender que poner en la app de Git.</w:t>
+        <w:t xml:space="preserve"> mucho a realizar la actividad de manera correcta y guiarme mucho la verdad igual lo pondré en la bibliografía pero me ayudo a entender que poner en la app de Git.</w:t>
       </w:r>
     </w:p>
     <w:p>
@@ -1144,21 +1114,364 @@
           <w:lang w:val="es-419"/>
         </w:rPr>
       </w:pPr>
-      <w:r>
-        <w:rPr>
-          <w:b/>
-          <w:bCs/>
-          <w:lang w:val="es-419"/>
-        </w:rPr>
-        <w:t xml:space="preserve">Diagrama </w:t>
-      </w:r>
-      <w:r>
-        <w:rPr>
-          <w:b/>
-          <w:bCs/>
-          <w:lang w:val="es-419"/>
-        </w:rPr>
-        <w:t>de clases</w:t>
+      <w:proofErr w:type="spellStart"/>
+      <w:r>
+        <w:rPr>
+          <w:b/>
+          <w:bCs/>
+          <w:lang w:val="es-419"/>
+        </w:rPr>
+        <w:t>Configuracion</w:t>
+      </w:r>
+      <w:proofErr w:type="spellEnd"/>
+      <w:r>
+        <w:rPr>
+          <w:b/>
+          <w:bCs/>
+          <w:lang w:val="es-419"/>
+        </w:rPr>
+        <w:t xml:space="preserve"> de </w:t>
+      </w:r>
+      <w:proofErr w:type="spellStart"/>
+      <w:r>
+        <w:rPr>
+          <w:b/>
+          <w:bCs/>
+          <w:lang w:val="es-419"/>
+        </w:rPr>
+        <w:t>Analisis</w:t>
+      </w:r>
+      <w:proofErr w:type="spellEnd"/>
+      <w:r>
+        <w:rPr>
+          <w:b/>
+          <w:bCs/>
+          <w:lang w:val="es-419"/>
+        </w:rPr>
+        <w:t xml:space="preserve"> del problema</w:t>
+      </w:r>
+    </w:p>
+    <w:p>
+      <w:pPr>
+        <w:rPr>
+          <w:lang w:val="es-419"/>
+        </w:rPr>
+      </w:pPr>
+      <w:r>
+        <w:rPr>
+          <w:noProof/>
+          <w:lang w:val="es-419"/>
+        </w:rPr>
+        <w:drawing>
+          <wp:inline distT="0" distB="0" distL="0" distR="0" wp14:anchorId="49C54552" wp14:editId="2572FAD0">
+            <wp:extent cx="5931535" cy="3888105"/>
+            <wp:effectExtent l="0" t="0" r="0" b="0"/>
+            <wp:docPr id="8" name="Imagen 8"/>
+            <wp:cNvGraphicFramePr>
+              <a:graphicFrameLocks xmlns:a="http://schemas.openxmlformats.org/drawingml/2006/main" noChangeAspect="1"/>
+            </wp:cNvGraphicFramePr>
+            <a:graphic xmlns:a="http://schemas.openxmlformats.org/drawingml/2006/main">
+              <a:graphicData uri="http://schemas.openxmlformats.org/drawingml/2006/picture">
+                <pic:pic xmlns:pic="http://schemas.openxmlformats.org/drawingml/2006/picture">
+                  <pic:nvPicPr>
+                    <pic:cNvPr id="0" name="Picture 1"/>
+                    <pic:cNvPicPr>
+                      <a:picLocks noChangeAspect="1" noChangeArrowheads="1"/>
+                    </pic:cNvPicPr>
+                  </pic:nvPicPr>
+                  <pic:blipFill>
+                    <a:blip r:embed="rId16">
+                      <a:extLst>
+                        <a:ext uri="{28A0092B-C50C-407E-A947-70E740481C1C}">
+                          <a14:useLocalDpi xmlns:a14="http://schemas.microsoft.com/office/drawing/2010/main" val="0"/>
+                        </a:ext>
+                      </a:extLst>
+                    </a:blip>
+                    <a:srcRect/>
+                    <a:stretch>
+                      <a:fillRect/>
+                    </a:stretch>
+                  </pic:blipFill>
+                  <pic:spPr bwMode="auto">
+                    <a:xfrm>
+                      <a:off x="0" y="0"/>
+                      <a:ext cx="5931535" cy="3888105"/>
+                    </a:xfrm>
+                    <a:prstGeom prst="rect">
+                      <a:avLst/>
+                    </a:prstGeom>
+                    <a:noFill/>
+                    <a:ln>
+                      <a:noFill/>
+                    </a:ln>
+                  </pic:spPr>
+                </pic:pic>
+              </a:graphicData>
+            </a:graphic>
+          </wp:inline>
+        </w:drawing>
+      </w:r>
+    </w:p>
+    <w:p>
+      <w:pPr>
+        <w:rPr>
+          <w:lang w:val="es-419"/>
+        </w:rPr>
+      </w:pPr>
+      <w:r>
+        <w:rPr>
+          <w:lang w:val="es-419"/>
+        </w:rPr>
+        <w:t xml:space="preserve">Aquí decidí aplicar una sola vez lo de escribir todo el código de corrido ya que quería ver o comprobar si podía crear todo en una como dijo el profesor, pero también dijo que podían salir errores pero afortunadamente no fue el caso y salió todo de manera correcta agregando el análisis del problema en el </w:t>
+      </w:r>
+      <w:proofErr w:type="spellStart"/>
+      <w:r>
+        <w:rPr>
+          <w:lang w:val="es-419"/>
+        </w:rPr>
+        <w:t>Github</w:t>
+      </w:r>
+      <w:proofErr w:type="spellEnd"/>
+      <w:r>
+        <w:rPr>
+          <w:lang w:val="es-419"/>
+        </w:rPr>
+        <w:t xml:space="preserve"> de manera correcta, pero ya después decidí hacer todo uno por uno para que no me pase un error en el futuro.</w:t>
+      </w:r>
+    </w:p>
+    <w:p>
+      <w:pPr>
+        <w:rPr>
+          <w:b/>
+          <w:bCs/>
+          <w:lang w:val="es-419"/>
+        </w:rPr>
+      </w:pPr>
+      <w:r>
+        <w:rPr>
+          <w:b/>
+          <w:bCs/>
+          <w:lang w:val="es-419"/>
+        </w:rPr>
+        <w:t>Configura</w:t>
+      </w:r>
+      <w:r>
+        <w:rPr>
+          <w:b/>
+          <w:bCs/>
+          <w:lang w:val="es-419"/>
+        </w:rPr>
+        <w:t>ción de diagrama de casos uso.</w:t>
+      </w:r>
+    </w:p>
+    <w:p>
+      <w:pPr>
+        <w:rPr>
+          <w:b/>
+          <w:bCs/>
+          <w:lang w:val="es-419"/>
+        </w:rPr>
+      </w:pPr>
+      <w:r>
+        <w:rPr>
+          <w:b/>
+          <w:bCs/>
+          <w:noProof/>
+          <w:lang w:val="es-419"/>
+        </w:rPr>
+        <w:lastRenderedPageBreak/>
+        <w:drawing>
+          <wp:inline distT="0" distB="0" distL="0" distR="0" wp14:anchorId="4FC9B443" wp14:editId="515A69DD">
+            <wp:extent cx="5939790" cy="5104765"/>
+            <wp:effectExtent l="0" t="0" r="0" b="0"/>
+            <wp:docPr id="9" name="Imagen 9"/>
+            <wp:cNvGraphicFramePr>
+              <a:graphicFrameLocks xmlns:a="http://schemas.openxmlformats.org/drawingml/2006/main" noChangeAspect="1"/>
+            </wp:cNvGraphicFramePr>
+            <a:graphic xmlns:a="http://schemas.openxmlformats.org/drawingml/2006/main">
+              <a:graphicData uri="http://schemas.openxmlformats.org/drawingml/2006/picture">
+                <pic:pic xmlns:pic="http://schemas.openxmlformats.org/drawingml/2006/picture">
+                  <pic:nvPicPr>
+                    <pic:cNvPr id="0" name="Picture 2"/>
+                    <pic:cNvPicPr>
+                      <a:picLocks noChangeAspect="1" noChangeArrowheads="1"/>
+                    </pic:cNvPicPr>
+                  </pic:nvPicPr>
+                  <pic:blipFill>
+                    <a:blip r:embed="rId17">
+                      <a:extLst>
+                        <a:ext uri="{28A0092B-C50C-407E-A947-70E740481C1C}">
+                          <a14:useLocalDpi xmlns:a14="http://schemas.microsoft.com/office/drawing/2010/main" val="0"/>
+                        </a:ext>
+                      </a:extLst>
+                    </a:blip>
+                    <a:srcRect/>
+                    <a:stretch>
+                      <a:fillRect/>
+                    </a:stretch>
+                  </pic:blipFill>
+                  <pic:spPr bwMode="auto">
+                    <a:xfrm>
+                      <a:off x="0" y="0"/>
+                      <a:ext cx="5939790" cy="5104765"/>
+                    </a:xfrm>
+                    <a:prstGeom prst="rect">
+                      <a:avLst/>
+                    </a:prstGeom>
+                    <a:noFill/>
+                    <a:ln>
+                      <a:noFill/>
+                    </a:ln>
+                  </pic:spPr>
+                </pic:pic>
+              </a:graphicData>
+            </a:graphic>
+          </wp:inline>
+        </w:drawing>
+      </w:r>
+    </w:p>
+    <w:p>
+      <w:pPr>
+        <w:rPr>
+          <w:lang w:val="es-419"/>
+        </w:rPr>
+      </w:pPr>
+      <w:r>
+        <w:rPr>
+          <w:lang w:val="es-419"/>
+        </w:rPr>
+        <w:t xml:space="preserve">Aquí ya </w:t>
+      </w:r>
+      <w:r>
+        <w:rPr>
+          <w:lang w:val="es-419"/>
+        </w:rPr>
+        <w:t>realicé</w:t>
+      </w:r>
+      <w:r>
+        <w:rPr>
+          <w:lang w:val="es-419"/>
+        </w:rPr>
+        <w:t xml:space="preserve"> código por código y hasta comprobación para que este todo correcto eso si quería escribir sin modificar nada en el Word y no se realizaban los comentario</w:t>
+      </w:r>
+      <w:r>
+        <w:rPr>
+          <w:lang w:val="es-419"/>
+        </w:rPr>
+        <w:t>s correspondientes al menos me di cuenta a tiempo y tuve que usar los comandos nuevamente para que se realicen los comentarios deseados.</w:t>
+      </w:r>
+    </w:p>
+    <w:p>
+      <w:pPr>
+        <w:rPr>
+          <w:b/>
+          <w:bCs/>
+          <w:lang w:val="es-419"/>
+        </w:rPr>
+      </w:pPr>
+      <w:r>
+        <w:rPr>
+          <w:b/>
+          <w:bCs/>
+          <w:lang w:val="es-419"/>
+        </w:rPr>
+        <w:t>Configuración de Diagrama Clase</w:t>
+      </w:r>
+    </w:p>
+    <w:p>
+      <w:pPr>
+        <w:rPr>
+          <w:b/>
+          <w:bCs/>
+          <w:lang w:val="es-419"/>
+        </w:rPr>
+      </w:pPr>
+      <w:r>
+        <w:rPr>
+          <w:b/>
+          <w:bCs/>
+          <w:noProof/>
+          <w:lang w:val="es-419"/>
+        </w:rPr>
+        <w:drawing>
+          <wp:inline distT="0" distB="0" distL="0" distR="0" wp14:anchorId="732F51E4" wp14:editId="66D648A8">
+            <wp:extent cx="5939790" cy="1788795"/>
+            <wp:effectExtent l="0" t="0" r="0" b="0"/>
+            <wp:docPr id="10" name="Imagen 10"/>
+            <wp:cNvGraphicFramePr>
+              <a:graphicFrameLocks xmlns:a="http://schemas.openxmlformats.org/drawingml/2006/main" noChangeAspect="1"/>
+            </wp:cNvGraphicFramePr>
+            <a:graphic xmlns:a="http://schemas.openxmlformats.org/drawingml/2006/main">
+              <a:graphicData uri="http://schemas.openxmlformats.org/drawingml/2006/picture">
+                <pic:pic xmlns:pic="http://schemas.openxmlformats.org/drawingml/2006/picture">
+                  <pic:nvPicPr>
+                    <pic:cNvPr id="0" name="Picture 3"/>
+                    <pic:cNvPicPr>
+                      <a:picLocks noChangeAspect="1" noChangeArrowheads="1"/>
+                    </pic:cNvPicPr>
+                  </pic:nvPicPr>
+                  <pic:blipFill>
+                    <a:blip r:embed="rId18">
+                      <a:extLst>
+                        <a:ext uri="{28A0092B-C50C-407E-A947-70E740481C1C}">
+                          <a14:useLocalDpi xmlns:a14="http://schemas.microsoft.com/office/drawing/2010/main" val="0"/>
+                        </a:ext>
+                      </a:extLst>
+                    </a:blip>
+                    <a:srcRect/>
+                    <a:stretch>
+                      <a:fillRect/>
+                    </a:stretch>
+                  </pic:blipFill>
+                  <pic:spPr bwMode="auto">
+                    <a:xfrm>
+                      <a:off x="0" y="0"/>
+                      <a:ext cx="5939790" cy="1788795"/>
+                    </a:xfrm>
+                    <a:prstGeom prst="rect">
+                      <a:avLst/>
+                    </a:prstGeom>
+                    <a:noFill/>
+                    <a:ln>
+                      <a:noFill/>
+                    </a:ln>
+                  </pic:spPr>
+                </pic:pic>
+              </a:graphicData>
+            </a:graphic>
+          </wp:inline>
+        </w:drawing>
+      </w:r>
+    </w:p>
+    <w:p>
+      <w:pPr>
+        <w:rPr>
+          <w:lang w:val="es-419"/>
+        </w:rPr>
+      </w:pPr>
+      <w:r>
+        <w:rPr>
+          <w:lang w:val="es-419"/>
+        </w:rPr>
+        <w:lastRenderedPageBreak/>
+        <w:t>Aquí se puede ver que hice los comentarios correspondientes y salió todo de manera correcta y hasta se ve que dice que el árbol está limpio.</w:t>
+      </w:r>
+    </w:p>
+    <w:p>
+      <w:pPr>
+        <w:rPr>
+          <w:b/>
+          <w:bCs/>
+          <w:lang w:val="es-419"/>
+        </w:rPr>
+      </w:pPr>
+      <w:r>
+        <w:rPr>
+          <w:b/>
+          <w:bCs/>
+          <w:lang w:val="es-419"/>
+        </w:rPr>
+        <w:t>Configuración de la rama de Arquitectura</w:t>
       </w:r>
     </w:p>
     <w:p>

</xml_diff>

<commit_message>
Apliacion del patron Singleton para el motor de gestion de casos
</commit_message>
<xml_diff>
--- a/Meza_Jasef_Actividad1.docx
+++ b/Meza_Jasef_Actividad1.docx
@@ -508,6 +508,7 @@
         <w:t xml:space="preserve">git config –global </w:t>
       </w:r>
       <w:proofErr w:type="spellStart"/>
+      <w:proofErr w:type="gramStart"/>
       <w:r>
         <w:t>user.m</w:t>
       </w:r>
@@ -515,6 +516,7 @@
         <w:t>ail</w:t>
       </w:r>
       <w:proofErr w:type="spellEnd"/>
+      <w:proofErr w:type="gramEnd"/>
       <w:r>
         <w:t xml:space="preserve"> “</w:t>
       </w:r>
@@ -760,7 +762,21 @@
         <w:rPr>
           <w:lang w:val="es-419"/>
         </w:rPr>
-        <w:t xml:space="preserve">Aquí si tuve que investigar ya que aunque el profesor explico </w:t>
+        <w:t xml:space="preserve">Aquí si tuve que investigar ya </w:t>
+      </w:r>
+      <w:proofErr w:type="gramStart"/>
+      <w:r>
+        <w:rPr>
+          <w:lang w:val="es-419"/>
+        </w:rPr>
+        <w:t>que</w:t>
+      </w:r>
+      <w:proofErr w:type="gramEnd"/>
+      <w:r>
+        <w:rPr>
+          <w:lang w:val="es-419"/>
+        </w:rPr>
+        <w:t xml:space="preserve"> aunque el profesor explico </w:t>
       </w:r>
       <w:r>
         <w:rPr>
@@ -883,7 +899,21 @@
         <w:rPr>
           <w:lang w:val="es-419"/>
         </w:rPr>
-        <w:t xml:space="preserve"> mucho a realizar la actividad de manera correcta y guiarme mucho la verdad igual lo pondré en la bibliografía pero me ayudo a entender que poner en la app de Git.</w:t>
+        <w:t xml:space="preserve"> mucho a realizar la actividad de manera correcta y guiarme mucho la verdad igual lo pondré en la </w:t>
+      </w:r>
+      <w:proofErr w:type="gramStart"/>
+      <w:r>
+        <w:rPr>
+          <w:lang w:val="es-419"/>
+        </w:rPr>
+        <w:t>bibliografía</w:t>
+      </w:r>
+      <w:proofErr w:type="gramEnd"/>
+      <w:r>
+        <w:rPr>
+          <w:lang w:val="es-419"/>
+        </w:rPr>
+        <w:t xml:space="preserve"> pero me ayudo a entender que poner en la app de Git.</w:t>
       </w:r>
     </w:p>
     <w:p>
@@ -1222,7 +1252,21 @@
         <w:rPr>
           <w:lang w:val="es-419"/>
         </w:rPr>
-        <w:t xml:space="preserve">Aquí decidí aplicar una sola vez lo de escribir todo el código de corrido ya que quería ver o comprobar si podía crear todo en una como dijo el profesor, pero también dijo que podían salir errores pero afortunadamente no fue el caso y salió todo de manera correcta agregando el análisis del problema en el </w:t>
+        <w:t xml:space="preserve">Aquí decidí aplicar una sola vez lo de escribir todo el código de corrido ya que quería ver o comprobar si podía crear todo en una como dijo el profesor, pero también dijo que podían salir </w:t>
+      </w:r>
+      <w:proofErr w:type="gramStart"/>
+      <w:r>
+        <w:rPr>
+          <w:lang w:val="es-419"/>
+        </w:rPr>
+        <w:t>errores</w:t>
+      </w:r>
+      <w:proofErr w:type="gramEnd"/>
+      <w:r>
+        <w:rPr>
+          <w:lang w:val="es-419"/>
+        </w:rPr>
+        <w:t xml:space="preserve"> pero afortunadamente no fue el caso y salió todo de manera correcta agregando el análisis del problema en el </w:t>
       </w:r>
       <w:proofErr w:type="spellStart"/>
       <w:r>
@@ -1479,6 +1523,85 @@
         <w:rPr>
           <w:b/>
           <w:bCs/>
+          <w:lang w:val="es-419"/>
+        </w:rPr>
+      </w:pPr>
+      <w:r>
+        <w:rPr>
+          <w:b/>
+          <w:bCs/>
+          <w:lang w:val="es-419"/>
+        </w:rPr>
+        <w:drawing>
+          <wp:inline distT="0" distB="0" distL="0" distR="0" wp14:anchorId="3DEF10C9" wp14:editId="228CFFE7">
+            <wp:extent cx="5943600" cy="4781550"/>
+            <wp:effectExtent l="0" t="0" r="0" b="0"/>
+            <wp:docPr id="11" name="Imagen 11"/>
+            <wp:cNvGraphicFramePr>
+              <a:graphicFrameLocks xmlns:a="http://schemas.openxmlformats.org/drawingml/2006/main" noChangeAspect="1"/>
+            </wp:cNvGraphicFramePr>
+            <a:graphic xmlns:a="http://schemas.openxmlformats.org/drawingml/2006/main">
+              <a:graphicData uri="http://schemas.openxmlformats.org/drawingml/2006/picture">
+                <pic:pic xmlns:pic="http://schemas.openxmlformats.org/drawingml/2006/picture">
+                  <pic:nvPicPr>
+                    <pic:cNvPr id="1" name=""/>
+                    <pic:cNvPicPr/>
+                  </pic:nvPicPr>
+                  <pic:blipFill>
+                    <a:blip r:embed="rId19"/>
+                    <a:stretch>
+                      <a:fillRect/>
+                    </a:stretch>
+                  </pic:blipFill>
+                  <pic:spPr>
+                    <a:xfrm>
+                      <a:off x="0" y="0"/>
+                      <a:ext cx="5943600" cy="4781550"/>
+                    </a:xfrm>
+                    <a:prstGeom prst="rect">
+                      <a:avLst/>
+                    </a:prstGeom>
+                  </pic:spPr>
+                </pic:pic>
+              </a:graphicData>
+            </a:graphic>
+          </wp:inline>
+        </w:drawing>
+      </w:r>
+    </w:p>
+    <w:p>
+      <w:pPr>
+        <w:rPr>
+          <w:lang w:val="es-419"/>
+        </w:rPr>
+      </w:pPr>
+      <w:r>
+        <w:rPr>
+          <w:lang w:val="es-419"/>
+        </w:rPr>
+        <w:t>Aquí ya realicé los códigos correctos y sale de manera correcta aplicando cada cosa que nos recomendó o realizo el profesor.</w:t>
+      </w:r>
+    </w:p>
+    <w:p>
+      <w:pPr>
+        <w:rPr>
+          <w:b/>
+          <w:bCs/>
+          <w:lang w:val="es-419"/>
+        </w:rPr>
+      </w:pPr>
+      <w:r>
+        <w:rPr>
+          <w:b/>
+          <w:bCs/>
+          <w:lang w:val="es-419"/>
+        </w:rPr>
+        <w:t>Configuración de patrones de diseño</w:t>
+      </w:r>
+    </w:p>
+    <w:p>
+      <w:pPr>
+        <w:rPr>
           <w:lang w:val="es-419"/>
         </w:rPr>
       </w:pPr>

</xml_diff>

<commit_message>
Aplicacion del patron Observer para notificacions a voluntarios
</commit_message>
<xml_diff>
--- a/Meza_Jasef_Actividad1.docx
+++ b/Meza_Jasef_Actividad1.docx
@@ -468,33 +468,11 @@
           <w:lang w:val="es-419"/>
         </w:rPr>
       </w:pPr>
-      <w:proofErr w:type="spellStart"/>
-      <w:r>
-        <w:rPr>
-          <w:lang w:val="es-419"/>
-        </w:rPr>
-        <w:t>git</w:t>
-      </w:r>
-      <w:proofErr w:type="spellEnd"/>
-      <w:r>
-        <w:rPr>
-          <w:lang w:val="es-419"/>
-        </w:rPr>
-        <w:t xml:space="preserve"> </w:t>
-      </w:r>
-      <w:proofErr w:type="spellStart"/>
-      <w:r>
-        <w:rPr>
-          <w:lang w:val="es-419"/>
-        </w:rPr>
-        <w:t>config</w:t>
-      </w:r>
-      <w:proofErr w:type="spellEnd"/>
-      <w:r>
-        <w:rPr>
-          <w:lang w:val="es-419"/>
-        </w:rPr>
-        <w:t xml:space="preserve"> –global user.name “Jasef Nicolas Meza Ceval</w:t>
+      <w:r>
+        <w:rPr>
+          <w:lang w:val="es-419"/>
+        </w:rPr>
+        <w:t>git config –global user.name “Jasef Nicolas Meza Ceval</w:t>
       </w:r>
       <w:r>
         <w:rPr>
@@ -505,20 +483,10 @@
     </w:p>
     <w:p>
       <w:r>
-        <w:t xml:space="preserve">git config –global </w:t>
-      </w:r>
-      <w:proofErr w:type="spellStart"/>
-      <w:proofErr w:type="gramStart"/>
-      <w:r>
-        <w:t>user.m</w:t>
-      </w:r>
-      <w:r>
-        <w:t>ail</w:t>
-      </w:r>
-      <w:proofErr w:type="spellEnd"/>
-      <w:proofErr w:type="gramEnd"/>
-      <w:r>
-        <w:t xml:space="preserve"> “</w:t>
+        <w:t>git config –global user.m</w:t>
+      </w:r>
+      <w:r>
+        <w:t>ail “</w:t>
       </w:r>
       <w:hyperlink r:id="rId9" w:history="1">
         <w:r>
@@ -548,21 +516,7 @@
         <w:rPr>
           <w:lang w:val="es-419"/>
         </w:rPr>
-        <w:t xml:space="preserve">ue tuve que apoyarme un poco con la IA ya que no se me reflejaba como el profesor explico </w:t>
-      </w:r>
-      <w:proofErr w:type="spellStart"/>
-      <w:r>
-        <w:rPr>
-          <w:lang w:val="es-419"/>
-        </w:rPr>
-        <w:t>asi</w:t>
-      </w:r>
-      <w:proofErr w:type="spellEnd"/>
-      <w:r>
-        <w:rPr>
-          <w:lang w:val="es-419"/>
-        </w:rPr>
-        <w:t xml:space="preserve"> que me apoye mas no realice las conexiones con ninguna IA.</w:t>
+        <w:t>ue tuve que apoyarme un poco con la IA ya que no se me reflejaba como el profesor explico asi que me apoye mas no realice las conexiones con ninguna IA.</w:t>
       </w:r>
     </w:p>
     <w:p>
@@ -635,49 +589,7 @@
         <w:rPr>
           <w:lang w:val="es-419"/>
         </w:rPr>
-        <w:t xml:space="preserve"> la conexión de manera correcta ya que me </w:t>
-      </w:r>
-      <w:proofErr w:type="spellStart"/>
-      <w:r>
-        <w:rPr>
-          <w:lang w:val="es-419"/>
-        </w:rPr>
-        <w:t>salia</w:t>
-      </w:r>
-      <w:proofErr w:type="spellEnd"/>
-      <w:r>
-        <w:rPr>
-          <w:lang w:val="es-419"/>
-        </w:rPr>
-        <w:t xml:space="preserve"> un error que no me </w:t>
-      </w:r>
-      <w:proofErr w:type="spellStart"/>
-      <w:r>
-        <w:rPr>
-          <w:lang w:val="es-419"/>
-        </w:rPr>
-        <w:t>permitia</w:t>
-      </w:r>
-      <w:proofErr w:type="spellEnd"/>
-      <w:r>
-        <w:rPr>
-          <w:lang w:val="es-419"/>
-        </w:rPr>
-        <w:t xml:space="preserve"> agregar información ya que no había un Word antes y tuve que apoyarme con los documentos para corregir ese error y ahora en el </w:t>
-      </w:r>
-      <w:proofErr w:type="spellStart"/>
-      <w:r>
-        <w:rPr>
-          <w:lang w:val="es-419"/>
-        </w:rPr>
-        <w:t>github</w:t>
-      </w:r>
-      <w:proofErr w:type="spellEnd"/>
-      <w:r>
-        <w:rPr>
-          <w:lang w:val="es-419"/>
-        </w:rPr>
-        <w:t xml:space="preserve"> si se realizan los cambios</w:t>
+        <w:t xml:space="preserve"> la conexión de manera correcta ya que me salia un error que no me permitia agregar información ya que no había un Word antes y tuve que apoyarme con los documentos para corregir ese error y ahora en el github si se realizan los cambios</w:t>
       </w:r>
       <w:r>
         <w:rPr>
@@ -762,55 +674,13 @@
         <w:rPr>
           <w:lang w:val="es-419"/>
         </w:rPr>
-        <w:t xml:space="preserve">Aquí si tuve que investigar ya </w:t>
-      </w:r>
-      <w:proofErr w:type="gramStart"/>
-      <w:r>
-        <w:rPr>
-          <w:lang w:val="es-419"/>
-        </w:rPr>
-        <w:t>que</w:t>
-      </w:r>
-      <w:proofErr w:type="gramEnd"/>
-      <w:r>
-        <w:rPr>
-          <w:lang w:val="es-419"/>
-        </w:rPr>
-        <w:t xml:space="preserve"> aunque el profesor explico </w:t>
-      </w:r>
-      <w:r>
-        <w:rPr>
-          <w:lang w:val="es-419"/>
-        </w:rPr>
-        <w:t xml:space="preserve">la teoría pero no el </w:t>
-      </w:r>
-      <w:proofErr w:type="spellStart"/>
-      <w:r>
-        <w:rPr>
-          <w:lang w:val="es-419"/>
-        </w:rPr>
-        <w:t>como</w:t>
-      </w:r>
-      <w:proofErr w:type="spellEnd"/>
-      <w:r>
-        <w:rPr>
-          <w:lang w:val="es-419"/>
-        </w:rPr>
-        <w:t xml:space="preserve"> hacerlo en </w:t>
-      </w:r>
-      <w:proofErr w:type="spellStart"/>
-      <w:r>
-        <w:rPr>
-          <w:lang w:val="es-419"/>
-        </w:rPr>
-        <w:t>Github</w:t>
-      </w:r>
-      <w:proofErr w:type="spellEnd"/>
-      <w:r>
-        <w:rPr>
-          <w:lang w:val="es-419"/>
-        </w:rPr>
-        <w:t xml:space="preserve"> al momento que estoy escribiendo este documento</w:t>
+        <w:t xml:space="preserve">Aquí si tuve que investigar ya que aunque el profesor explico </w:t>
+      </w:r>
+      <w:r>
+        <w:rPr>
+          <w:lang w:val="es-419"/>
+        </w:rPr>
+        <w:t>la teoría pero no el como hacerlo en Github al momento que estoy escribiendo este documento</w:t>
       </w:r>
     </w:p>
     <w:p>
@@ -871,49 +741,7 @@
         <w:rPr>
           <w:lang w:val="es-419"/>
         </w:rPr>
-        <w:t xml:space="preserve">Esta </w:t>
-      </w:r>
-      <w:proofErr w:type="spellStart"/>
-      <w:r>
-        <w:rPr>
-          <w:lang w:val="es-419"/>
-        </w:rPr>
-        <w:t>pagina</w:t>
-      </w:r>
-      <w:proofErr w:type="spellEnd"/>
-      <w:r>
-        <w:rPr>
-          <w:lang w:val="es-419"/>
-        </w:rPr>
-        <w:t xml:space="preserve"> me </w:t>
-      </w:r>
-      <w:proofErr w:type="spellStart"/>
-      <w:r>
-        <w:rPr>
-          <w:lang w:val="es-419"/>
-        </w:rPr>
-        <w:t>ayudo</w:t>
-      </w:r>
-      <w:proofErr w:type="spellEnd"/>
-      <w:r>
-        <w:rPr>
-          <w:lang w:val="es-419"/>
-        </w:rPr>
-        <w:t xml:space="preserve"> mucho a realizar la actividad de manera correcta y guiarme mucho la verdad igual lo pondré en la </w:t>
-      </w:r>
-      <w:proofErr w:type="gramStart"/>
-      <w:r>
-        <w:rPr>
-          <w:lang w:val="es-419"/>
-        </w:rPr>
-        <w:t>bibliografía</w:t>
-      </w:r>
-      <w:proofErr w:type="gramEnd"/>
-      <w:r>
-        <w:rPr>
-          <w:lang w:val="es-419"/>
-        </w:rPr>
-        <w:t xml:space="preserve"> pero me ayudo a entender que poner en la app de Git.</w:t>
+        <w:t>Esta pagina me ayudo mucho a realizar la actividad de manera correcta y guiarme mucho la verdad igual lo pondré en la bibliografía pero me ayudo a entender que poner en la app de Git.</w:t>
       </w:r>
     </w:p>
     <w:p>
@@ -981,35 +809,7 @@
         <w:rPr>
           <w:lang w:val="es-419"/>
         </w:rPr>
-        <w:t xml:space="preserve">una estructura como pide la actividad y ahora en el </w:t>
-      </w:r>
-      <w:proofErr w:type="spellStart"/>
-      <w:r>
-        <w:rPr>
-          <w:lang w:val="es-419"/>
-        </w:rPr>
-        <w:t>Github</w:t>
-      </w:r>
-      <w:proofErr w:type="spellEnd"/>
-      <w:r>
-        <w:rPr>
-          <w:lang w:val="es-419"/>
-        </w:rPr>
-        <w:t xml:space="preserve"> tengo un </w:t>
-      </w:r>
-      <w:proofErr w:type="spellStart"/>
-      <w:r>
-        <w:rPr>
-          <w:lang w:val="es-419"/>
-        </w:rPr>
-        <w:t>main</w:t>
-      </w:r>
-      <w:proofErr w:type="spellEnd"/>
-      <w:r>
-        <w:rPr>
-          <w:lang w:val="es-419"/>
-        </w:rPr>
-        <w:t xml:space="preserve"> y un master como lo pide ahora continuaremos con el siguiente paso:</w:t>
+        <w:t>una estructura como pide la actividad y ahora en el Github tengo un main y un master como lo pide ahora continuaremos con el siguiente paso:</w:t>
       </w:r>
     </w:p>
     <w:p>
@@ -1119,66 +919,24 @@
           <w:lang w:val="es-419"/>
         </w:rPr>
         <w:lastRenderedPageBreak/>
-        <w:t xml:space="preserve">Aquí como se puede ver realizamos la eliminación de </w:t>
-      </w:r>
-      <w:proofErr w:type="spellStart"/>
-      <w:r>
-        <w:rPr>
-          <w:lang w:val="es-419"/>
-        </w:rPr>
-        <w:t>main</w:t>
-      </w:r>
-      <w:proofErr w:type="spellEnd"/>
-      <w:r>
-        <w:rPr>
-          <w:lang w:val="es-419"/>
-        </w:rPr>
-        <w:t xml:space="preserve"> para cambiarlo por el master y todos los cambios se hicieron de manera correcta y sin errores.</w:t>
-      </w:r>
-    </w:p>
-    <w:p>
-      <w:pPr>
-        <w:rPr>
-          <w:b/>
-          <w:bCs/>
-          <w:lang w:val="es-419"/>
-        </w:rPr>
-      </w:pPr>
-      <w:proofErr w:type="spellStart"/>
-      <w:r>
-        <w:rPr>
-          <w:b/>
-          <w:bCs/>
-          <w:lang w:val="es-419"/>
-        </w:rPr>
-        <w:t>Configuracion</w:t>
-      </w:r>
-      <w:proofErr w:type="spellEnd"/>
-      <w:r>
-        <w:rPr>
-          <w:b/>
-          <w:bCs/>
-          <w:lang w:val="es-419"/>
-        </w:rPr>
-        <w:t xml:space="preserve"> de </w:t>
-      </w:r>
-      <w:proofErr w:type="spellStart"/>
-      <w:r>
-        <w:rPr>
-          <w:b/>
-          <w:bCs/>
-          <w:lang w:val="es-419"/>
-        </w:rPr>
-        <w:t>Analisis</w:t>
-      </w:r>
-      <w:proofErr w:type="spellEnd"/>
-      <w:r>
-        <w:rPr>
-          <w:b/>
-          <w:bCs/>
-          <w:lang w:val="es-419"/>
-        </w:rPr>
-        <w:t xml:space="preserve"> del problema</w:t>
+        <w:t>Aquí como se puede ver realizamos la eliminación de main para cambiarlo por el master y todos los cambios se hicieron de manera correcta y sin errores.</w:t>
+      </w:r>
+    </w:p>
+    <w:p>
+      <w:pPr>
+        <w:rPr>
+          <w:b/>
+          <w:bCs/>
+          <w:lang w:val="es-419"/>
+        </w:rPr>
+      </w:pPr>
+      <w:r>
+        <w:rPr>
+          <w:b/>
+          <w:bCs/>
+          <w:lang w:val="es-419"/>
+        </w:rPr>
+        <w:t>Configuracion de Analisis del problema</w:t>
       </w:r>
     </w:p>
     <w:p>
@@ -1252,35 +1010,7 @@
         <w:rPr>
           <w:lang w:val="es-419"/>
         </w:rPr>
-        <w:t xml:space="preserve">Aquí decidí aplicar una sola vez lo de escribir todo el código de corrido ya que quería ver o comprobar si podía crear todo en una como dijo el profesor, pero también dijo que podían salir </w:t>
-      </w:r>
-      <w:proofErr w:type="gramStart"/>
-      <w:r>
-        <w:rPr>
-          <w:lang w:val="es-419"/>
-        </w:rPr>
-        <w:t>errores</w:t>
-      </w:r>
-      <w:proofErr w:type="gramEnd"/>
-      <w:r>
-        <w:rPr>
-          <w:lang w:val="es-419"/>
-        </w:rPr>
-        <w:t xml:space="preserve"> pero afortunadamente no fue el caso y salió todo de manera correcta agregando el análisis del problema en el </w:t>
-      </w:r>
-      <w:proofErr w:type="spellStart"/>
-      <w:r>
-        <w:rPr>
-          <w:lang w:val="es-419"/>
-        </w:rPr>
-        <w:t>Github</w:t>
-      </w:r>
-      <w:proofErr w:type="spellEnd"/>
-      <w:r>
-        <w:rPr>
-          <w:lang w:val="es-419"/>
-        </w:rPr>
-        <w:t xml:space="preserve"> de manera correcta, pero ya después decidí hacer todo uno por uno para que no me pase un error en el futuro.</w:t>
+        <w:t>Aquí decidí aplicar una sola vez lo de escribir todo el código de corrido ya que quería ver o comprobar si podía crear todo en una como dijo el profesor, pero también dijo que podían salir errores pero afortunadamente no fue el caso y salió todo de manera correcta agregando el análisis del problema en el Github de manera correcta, pero ya después decidí hacer todo uno por uno para que no me pase un error en el futuro.</w:t>
       </w:r>
     </w:p>
     <w:p>
@@ -1530,6 +1260,7 @@
         <w:rPr>
           <w:b/>
           <w:bCs/>
+          <w:noProof/>
           <w:lang w:val="es-419"/>
         </w:rPr>
         <w:drawing>
@@ -1605,6 +1336,23 @@
           <w:lang w:val="es-419"/>
         </w:rPr>
       </w:pPr>
+    </w:p>
+    <w:p>
+      <w:pPr>
+        <w:rPr>
+          <w:b/>
+          <w:bCs/>
+          <w:lang w:val="es-419"/>
+        </w:rPr>
+      </w:pPr>
+      <w:r>
+        <w:rPr>
+          <w:b/>
+          <w:bCs/>
+          <w:lang w:val="es-419"/>
+        </w:rPr>
+        <w:t>Singleton</w:t>
+      </w:r>
     </w:p>
     <w:sectPr>
       <w:pgSz w:w="12240" w:h="15840"/>

</xml_diff>

<commit_message>
Aplicacion del patron de metodo Factory para expediente por especie
</commit_message>
<xml_diff>
--- a/Meza_Jasef_Actividad1.docx
+++ b/Meza_Jasef_Actividad1.docx
@@ -1352,6 +1352,48 @@
           <w:lang w:val="es-419"/>
         </w:rPr>
         <w:t>Singleton</w:t>
+      </w:r>
+    </w:p>
+    <w:p>
+      <w:pPr>
+        <w:rPr>
+          <w:b/>
+          <w:bCs/>
+          <w:lang w:val="es-419"/>
+        </w:rPr>
+      </w:pPr>
+    </w:p>
+    <w:p>
+      <w:pPr>
+        <w:rPr>
+          <w:b/>
+          <w:bCs/>
+          <w:lang w:val="es-419"/>
+        </w:rPr>
+      </w:pPr>
+      <w:r>
+        <w:rPr>
+          <w:b/>
+          <w:bCs/>
+          <w:lang w:val="es-419"/>
+        </w:rPr>
+        <w:t>Me</w:t>
+      </w:r>
+      <w:r>
+        <w:rPr>
+          <w:b/>
+          <w:bCs/>
+          <w:lang w:val="es-419"/>
+        </w:rPr>
+        <w:t>thod</w:t>
+      </w:r>
+      <w:r>
+        <w:rPr>
+          <w:b/>
+          <w:bCs/>
+          <w:lang w:val="es-419"/>
+        </w:rPr>
+        <w:t xml:space="preserve"> Factory</w:t>
       </w:r>
     </w:p>
     <w:sectPr>

</xml_diff>

<commit_message>
Aplicacion del patron MVC que pide en la actividad
</commit_message>
<xml_diff>
--- a/Meza_Jasef_Actividad1.docx
+++ b/Meza_Jasef_Actividad1.docx
@@ -468,11 +468,33 @@
           <w:lang w:val="es-419"/>
         </w:rPr>
       </w:pPr>
-      <w:r>
-        <w:rPr>
-          <w:lang w:val="es-419"/>
-        </w:rPr>
-        <w:t>git config –global user.name “Jasef Nicolas Meza Ceval</w:t>
+      <w:proofErr w:type="spellStart"/>
+      <w:r>
+        <w:rPr>
+          <w:lang w:val="es-419"/>
+        </w:rPr>
+        <w:t>git</w:t>
+      </w:r>
+      <w:proofErr w:type="spellEnd"/>
+      <w:r>
+        <w:rPr>
+          <w:lang w:val="es-419"/>
+        </w:rPr>
+        <w:t xml:space="preserve"> </w:t>
+      </w:r>
+      <w:proofErr w:type="spellStart"/>
+      <w:r>
+        <w:rPr>
+          <w:lang w:val="es-419"/>
+        </w:rPr>
+        <w:t>config</w:t>
+      </w:r>
+      <w:proofErr w:type="spellEnd"/>
+      <w:r>
+        <w:rPr>
+          <w:lang w:val="es-419"/>
+        </w:rPr>
+        <w:t xml:space="preserve"> –global user.name “Jasef Nicolas Meza Ceval</w:t>
       </w:r>
       <w:r>
         <w:rPr>
@@ -483,10 +505,20 @@
     </w:p>
     <w:p>
       <w:r>
-        <w:t>git config –global user.m</w:t>
-      </w:r>
-      <w:r>
-        <w:t>ail “</w:t>
+        <w:t xml:space="preserve">git config –global </w:t>
+      </w:r>
+      <w:proofErr w:type="spellStart"/>
+      <w:proofErr w:type="gramStart"/>
+      <w:r>
+        <w:t>user.m</w:t>
+      </w:r>
+      <w:r>
+        <w:t>ail</w:t>
+      </w:r>
+      <w:proofErr w:type="spellEnd"/>
+      <w:proofErr w:type="gramEnd"/>
+      <w:r>
+        <w:t xml:space="preserve"> “</w:t>
       </w:r>
       <w:hyperlink r:id="rId9" w:history="1">
         <w:r>
@@ -516,7 +548,21 @@
         <w:rPr>
           <w:lang w:val="es-419"/>
         </w:rPr>
-        <w:t>ue tuve que apoyarme un poco con la IA ya que no se me reflejaba como el profesor explico asi que me apoye mas no realice las conexiones con ninguna IA.</w:t>
+        <w:t xml:space="preserve">ue tuve que apoyarme un poco con la IA ya que no se me reflejaba como el profesor explico </w:t>
+      </w:r>
+      <w:proofErr w:type="spellStart"/>
+      <w:r>
+        <w:rPr>
+          <w:lang w:val="es-419"/>
+        </w:rPr>
+        <w:t>asi</w:t>
+      </w:r>
+      <w:proofErr w:type="spellEnd"/>
+      <w:r>
+        <w:rPr>
+          <w:lang w:val="es-419"/>
+        </w:rPr>
+        <w:t xml:space="preserve"> que me apoye mas no realice las conexiones con ninguna IA.</w:t>
       </w:r>
     </w:p>
     <w:p>
@@ -589,7 +635,49 @@
         <w:rPr>
           <w:lang w:val="es-419"/>
         </w:rPr>
-        <w:t xml:space="preserve"> la conexión de manera correcta ya que me salia un error que no me permitia agregar información ya que no había un Word antes y tuve que apoyarme con los documentos para corregir ese error y ahora en el github si se realizan los cambios</w:t>
+        <w:t xml:space="preserve"> la conexión de manera correcta ya que me </w:t>
+      </w:r>
+      <w:proofErr w:type="spellStart"/>
+      <w:r>
+        <w:rPr>
+          <w:lang w:val="es-419"/>
+        </w:rPr>
+        <w:t>salia</w:t>
+      </w:r>
+      <w:proofErr w:type="spellEnd"/>
+      <w:r>
+        <w:rPr>
+          <w:lang w:val="es-419"/>
+        </w:rPr>
+        <w:t xml:space="preserve"> un error que no me </w:t>
+      </w:r>
+      <w:proofErr w:type="spellStart"/>
+      <w:r>
+        <w:rPr>
+          <w:lang w:val="es-419"/>
+        </w:rPr>
+        <w:t>permitia</w:t>
+      </w:r>
+      <w:proofErr w:type="spellEnd"/>
+      <w:r>
+        <w:rPr>
+          <w:lang w:val="es-419"/>
+        </w:rPr>
+        <w:t xml:space="preserve"> agregar información ya que no había un Word antes y tuve que apoyarme con los documentos para corregir ese error y ahora en el </w:t>
+      </w:r>
+      <w:proofErr w:type="spellStart"/>
+      <w:r>
+        <w:rPr>
+          <w:lang w:val="es-419"/>
+        </w:rPr>
+        <w:t>github</w:t>
+      </w:r>
+      <w:proofErr w:type="spellEnd"/>
+      <w:r>
+        <w:rPr>
+          <w:lang w:val="es-419"/>
+        </w:rPr>
+        <w:t xml:space="preserve"> si se realizan los cambios</w:t>
       </w:r>
       <w:r>
         <w:rPr>
@@ -674,13 +762,55 @@
         <w:rPr>
           <w:lang w:val="es-419"/>
         </w:rPr>
-        <w:t xml:space="preserve">Aquí si tuve que investigar ya que aunque el profesor explico </w:t>
-      </w:r>
-      <w:r>
-        <w:rPr>
-          <w:lang w:val="es-419"/>
-        </w:rPr>
-        <w:t>la teoría pero no el como hacerlo en Github al momento que estoy escribiendo este documento</w:t>
+        <w:t xml:space="preserve">Aquí si tuve que investigar ya </w:t>
+      </w:r>
+      <w:proofErr w:type="gramStart"/>
+      <w:r>
+        <w:rPr>
+          <w:lang w:val="es-419"/>
+        </w:rPr>
+        <w:t>que</w:t>
+      </w:r>
+      <w:proofErr w:type="gramEnd"/>
+      <w:r>
+        <w:rPr>
+          <w:lang w:val="es-419"/>
+        </w:rPr>
+        <w:t xml:space="preserve"> aunque el profesor explico </w:t>
+      </w:r>
+      <w:r>
+        <w:rPr>
+          <w:lang w:val="es-419"/>
+        </w:rPr>
+        <w:t xml:space="preserve">la teoría pero no el </w:t>
+      </w:r>
+      <w:proofErr w:type="spellStart"/>
+      <w:r>
+        <w:rPr>
+          <w:lang w:val="es-419"/>
+        </w:rPr>
+        <w:t>como</w:t>
+      </w:r>
+      <w:proofErr w:type="spellEnd"/>
+      <w:r>
+        <w:rPr>
+          <w:lang w:val="es-419"/>
+        </w:rPr>
+        <w:t xml:space="preserve"> hacerlo en </w:t>
+      </w:r>
+      <w:proofErr w:type="spellStart"/>
+      <w:r>
+        <w:rPr>
+          <w:lang w:val="es-419"/>
+        </w:rPr>
+        <w:t>Github</w:t>
+      </w:r>
+      <w:proofErr w:type="spellEnd"/>
+      <w:r>
+        <w:rPr>
+          <w:lang w:val="es-419"/>
+        </w:rPr>
+        <w:t xml:space="preserve"> al momento que estoy escribiendo este documento</w:t>
       </w:r>
     </w:p>
     <w:p>
@@ -741,7 +871,49 @@
         <w:rPr>
           <w:lang w:val="es-419"/>
         </w:rPr>
-        <w:t>Esta pagina me ayudo mucho a realizar la actividad de manera correcta y guiarme mucho la verdad igual lo pondré en la bibliografía pero me ayudo a entender que poner en la app de Git.</w:t>
+        <w:t xml:space="preserve">Esta </w:t>
+      </w:r>
+      <w:proofErr w:type="spellStart"/>
+      <w:r>
+        <w:rPr>
+          <w:lang w:val="es-419"/>
+        </w:rPr>
+        <w:t>pagina</w:t>
+      </w:r>
+      <w:proofErr w:type="spellEnd"/>
+      <w:r>
+        <w:rPr>
+          <w:lang w:val="es-419"/>
+        </w:rPr>
+        <w:t xml:space="preserve"> me </w:t>
+      </w:r>
+      <w:proofErr w:type="spellStart"/>
+      <w:r>
+        <w:rPr>
+          <w:lang w:val="es-419"/>
+        </w:rPr>
+        <w:t>ayudo</w:t>
+      </w:r>
+      <w:proofErr w:type="spellEnd"/>
+      <w:r>
+        <w:rPr>
+          <w:lang w:val="es-419"/>
+        </w:rPr>
+        <w:t xml:space="preserve"> mucho a realizar la actividad de manera correcta y guiarme mucho la verdad igual lo pondré en la </w:t>
+      </w:r>
+      <w:proofErr w:type="gramStart"/>
+      <w:r>
+        <w:rPr>
+          <w:lang w:val="es-419"/>
+        </w:rPr>
+        <w:t>bibliografía</w:t>
+      </w:r>
+      <w:proofErr w:type="gramEnd"/>
+      <w:r>
+        <w:rPr>
+          <w:lang w:val="es-419"/>
+        </w:rPr>
+        <w:t xml:space="preserve"> pero me ayudo a entender que poner en la app de Git.</w:t>
       </w:r>
     </w:p>
     <w:p>
@@ -809,7 +981,35 @@
         <w:rPr>
           <w:lang w:val="es-419"/>
         </w:rPr>
-        <w:t>una estructura como pide la actividad y ahora en el Github tengo un main y un master como lo pide ahora continuaremos con el siguiente paso:</w:t>
+        <w:t xml:space="preserve">una estructura como pide la actividad y ahora en el </w:t>
+      </w:r>
+      <w:proofErr w:type="spellStart"/>
+      <w:r>
+        <w:rPr>
+          <w:lang w:val="es-419"/>
+        </w:rPr>
+        <w:t>Github</w:t>
+      </w:r>
+      <w:proofErr w:type="spellEnd"/>
+      <w:r>
+        <w:rPr>
+          <w:lang w:val="es-419"/>
+        </w:rPr>
+        <w:t xml:space="preserve"> tengo un </w:t>
+      </w:r>
+      <w:proofErr w:type="spellStart"/>
+      <w:r>
+        <w:rPr>
+          <w:lang w:val="es-419"/>
+        </w:rPr>
+        <w:t>main</w:t>
+      </w:r>
+      <w:proofErr w:type="spellEnd"/>
+      <w:r>
+        <w:rPr>
+          <w:lang w:val="es-419"/>
+        </w:rPr>
+        <w:t xml:space="preserve"> y un master como lo pide ahora continuaremos con el siguiente paso:</w:t>
       </w:r>
     </w:p>
     <w:p>
@@ -919,24 +1119,66 @@
           <w:lang w:val="es-419"/>
         </w:rPr>
         <w:lastRenderedPageBreak/>
-        <w:t>Aquí como se puede ver realizamos la eliminación de main para cambiarlo por el master y todos los cambios se hicieron de manera correcta y sin errores.</w:t>
-      </w:r>
-    </w:p>
-    <w:p>
-      <w:pPr>
-        <w:rPr>
-          <w:b/>
-          <w:bCs/>
-          <w:lang w:val="es-419"/>
-        </w:rPr>
-      </w:pPr>
-      <w:r>
-        <w:rPr>
-          <w:b/>
-          <w:bCs/>
-          <w:lang w:val="es-419"/>
-        </w:rPr>
-        <w:t>Configuracion de Analisis del problema</w:t>
+        <w:t xml:space="preserve">Aquí como se puede ver realizamos la eliminación de </w:t>
+      </w:r>
+      <w:proofErr w:type="spellStart"/>
+      <w:r>
+        <w:rPr>
+          <w:lang w:val="es-419"/>
+        </w:rPr>
+        <w:t>main</w:t>
+      </w:r>
+      <w:proofErr w:type="spellEnd"/>
+      <w:r>
+        <w:rPr>
+          <w:lang w:val="es-419"/>
+        </w:rPr>
+        <w:t xml:space="preserve"> para cambiarlo por el master y todos los cambios se hicieron de manera correcta y sin errores.</w:t>
+      </w:r>
+    </w:p>
+    <w:p>
+      <w:pPr>
+        <w:rPr>
+          <w:b/>
+          <w:bCs/>
+          <w:lang w:val="es-419"/>
+        </w:rPr>
+      </w:pPr>
+      <w:proofErr w:type="spellStart"/>
+      <w:r>
+        <w:rPr>
+          <w:b/>
+          <w:bCs/>
+          <w:lang w:val="es-419"/>
+        </w:rPr>
+        <w:t>Configuracion</w:t>
+      </w:r>
+      <w:proofErr w:type="spellEnd"/>
+      <w:r>
+        <w:rPr>
+          <w:b/>
+          <w:bCs/>
+          <w:lang w:val="es-419"/>
+        </w:rPr>
+        <w:t xml:space="preserve"> de </w:t>
+      </w:r>
+      <w:proofErr w:type="spellStart"/>
+      <w:r>
+        <w:rPr>
+          <w:b/>
+          <w:bCs/>
+          <w:lang w:val="es-419"/>
+        </w:rPr>
+        <w:t>Analisis</w:t>
+      </w:r>
+      <w:proofErr w:type="spellEnd"/>
+      <w:r>
+        <w:rPr>
+          <w:b/>
+          <w:bCs/>
+          <w:lang w:val="es-419"/>
+        </w:rPr>
+        <w:t xml:space="preserve"> del problema</w:t>
       </w:r>
     </w:p>
     <w:p>
@@ -1010,7 +1252,35 @@
         <w:rPr>
           <w:lang w:val="es-419"/>
         </w:rPr>
-        <w:t>Aquí decidí aplicar una sola vez lo de escribir todo el código de corrido ya que quería ver o comprobar si podía crear todo en una como dijo el profesor, pero también dijo que podían salir errores pero afortunadamente no fue el caso y salió todo de manera correcta agregando el análisis del problema en el Github de manera correcta, pero ya después decidí hacer todo uno por uno para que no me pase un error en el futuro.</w:t>
+        <w:t xml:space="preserve">Aquí decidí aplicar una sola vez lo de escribir todo el código de corrido ya que quería ver o comprobar si podía crear todo en una como dijo el profesor, pero también dijo que podían salir </w:t>
+      </w:r>
+      <w:proofErr w:type="gramStart"/>
+      <w:r>
+        <w:rPr>
+          <w:lang w:val="es-419"/>
+        </w:rPr>
+        <w:t>errores</w:t>
+      </w:r>
+      <w:proofErr w:type="gramEnd"/>
+      <w:r>
+        <w:rPr>
+          <w:lang w:val="es-419"/>
+        </w:rPr>
+        <w:t xml:space="preserve"> pero afortunadamente no fue el caso y salió todo de manera correcta agregando el análisis del problema en el </w:t>
+      </w:r>
+      <w:proofErr w:type="spellStart"/>
+      <w:r>
+        <w:rPr>
+          <w:lang w:val="es-419"/>
+        </w:rPr>
+        <w:t>Github</w:t>
+      </w:r>
+      <w:proofErr w:type="spellEnd"/>
+      <w:r>
+        <w:rPr>
+          <w:lang w:val="es-419"/>
+        </w:rPr>
+        <w:t xml:space="preserve"> de manera correcta, pero ya después decidí hacer todo uno por uno para que no me pase un error en el futuro.</w:t>
       </w:r>
     </w:p>
     <w:p>
@@ -1345,6 +1615,7 @@
           <w:lang w:val="es-419"/>
         </w:rPr>
       </w:pPr>
+      <w:proofErr w:type="spellStart"/>
       <w:r>
         <w:rPr>
           <w:b/>
@@ -1353,24 +1624,26 @@
         </w:rPr>
         <w:t>Singleton</w:t>
       </w:r>
-    </w:p>
-    <w:p>
-      <w:pPr>
-        <w:rPr>
-          <w:b/>
-          <w:bCs/>
-          <w:lang w:val="es-419"/>
-        </w:rPr>
-      </w:pPr>
-    </w:p>
-    <w:p>
-      <w:pPr>
-        <w:rPr>
-          <w:b/>
-          <w:bCs/>
-          <w:lang w:val="es-419"/>
-        </w:rPr>
-      </w:pPr>
+      <w:proofErr w:type="spellEnd"/>
+    </w:p>
+    <w:p>
+      <w:pPr>
+        <w:rPr>
+          <w:b/>
+          <w:bCs/>
+          <w:lang w:val="es-419"/>
+        </w:rPr>
+      </w:pPr>
+    </w:p>
+    <w:p>
+      <w:pPr>
+        <w:rPr>
+          <w:b/>
+          <w:bCs/>
+          <w:lang w:val="es-419"/>
+        </w:rPr>
+      </w:pPr>
+      <w:proofErr w:type="spellStart"/>
       <w:r>
         <w:rPr>
           <w:b/>
@@ -1387,6 +1660,7 @@
         </w:rPr>
         <w:t>thod</w:t>
       </w:r>
+      <w:proofErr w:type="spellEnd"/>
       <w:r>
         <w:rPr>
           <w:b/>
@@ -1395,6 +1669,50 @@
         </w:rPr>
         <w:t xml:space="preserve"> Factory</w:t>
       </w:r>
+    </w:p>
+    <w:p>
+      <w:pPr>
+        <w:rPr>
+          <w:b/>
+          <w:bCs/>
+          <w:lang w:val="es-419"/>
+        </w:rPr>
+      </w:pPr>
+    </w:p>
+    <w:p>
+      <w:pPr>
+        <w:rPr>
+          <w:b/>
+          <w:bCs/>
+          <w:lang w:val="es-419"/>
+        </w:rPr>
+      </w:pPr>
+      <w:r>
+        <w:rPr>
+          <w:b/>
+          <w:bCs/>
+          <w:lang w:val="es-419"/>
+        </w:rPr>
+        <w:t>MVC</w:t>
+      </w:r>
+    </w:p>
+    <w:p>
+      <w:pPr>
+        <w:rPr>
+          <w:b/>
+          <w:bCs/>
+          <w:lang w:val="es-419"/>
+        </w:rPr>
+      </w:pPr>
+    </w:p>
+    <w:p>
+      <w:pPr>
+        <w:rPr>
+          <w:b/>
+          <w:bCs/>
+          <w:lang w:val="es-419"/>
+        </w:rPr>
+      </w:pPr>
     </w:p>
     <w:sectPr>
       <w:pgSz w:w="12240" w:h="15840"/>

</xml_diff>

<commit_message>
Realice cambios finales en el Word a entregar
</commit_message>
<xml_diff>
--- a/Meza_Jasef_Actividad1.docx
+++ b/Meza_Jasef_Actividad1.docx
@@ -1144,6 +1144,14 @@
           <w:lang w:val="es-419"/>
         </w:rPr>
       </w:pPr>
+      <w:r>
+        <w:rPr>
+          <w:b/>
+          <w:bCs/>
+          <w:lang w:val="es-419"/>
+        </w:rPr>
+        <w:t xml:space="preserve">Rama 1: </w:t>
+      </w:r>
       <w:proofErr w:type="spellStart"/>
       <w:r>
         <w:rPr>
@@ -1291,6 +1299,14 @@
           <w:lang w:val="es-419"/>
         </w:rPr>
       </w:pPr>
+      <w:r>
+        <w:rPr>
+          <w:b/>
+          <w:bCs/>
+          <w:lang w:val="es-419"/>
+        </w:rPr>
+        <w:t xml:space="preserve">Rama 2: </w:t>
+      </w:r>
       <w:r>
         <w:rPr>
           <w:b/>
@@ -1419,6 +1435,14 @@
           <w:bCs/>
           <w:lang w:val="es-419"/>
         </w:rPr>
+        <w:t xml:space="preserve">Rama 3: </w:t>
+      </w:r>
+      <w:r>
+        <w:rPr>
+          <w:b/>
+          <w:bCs/>
+          <w:lang w:val="es-419"/>
+        </w:rPr>
         <w:t>Configuración de Diagrama Clase</w:t>
       </w:r>
     </w:p>
@@ -1515,6 +1539,14 @@
           <w:bCs/>
           <w:lang w:val="es-419"/>
         </w:rPr>
+        <w:t xml:space="preserve">Rama 4: </w:t>
+      </w:r>
+      <w:r>
+        <w:rPr>
+          <w:b/>
+          <w:bCs/>
+          <w:lang w:val="es-419"/>
+        </w:rPr>
         <w:t>Configuración de la rama de Arquitectura</w:t>
       </w:r>
     </w:p>
@@ -1597,6 +1629,14 @@
           <w:bCs/>
           <w:lang w:val="es-419"/>
         </w:rPr>
+        <w:t xml:space="preserve">Rama 5: </w:t>
+      </w:r>
+      <w:r>
+        <w:rPr>
+          <w:b/>
+          <w:bCs/>
+          <w:lang w:val="es-419"/>
+        </w:rPr>
         <w:t>Configuración de patrones de diseño</w:t>
       </w:r>
     </w:p>
@@ -1606,6 +1646,165 @@
           <w:lang w:val="es-419"/>
         </w:rPr>
       </w:pPr>
+      <w:r>
+        <w:rPr>
+          <w:noProof/>
+          <w:lang w:val="es-419"/>
+        </w:rPr>
+        <w:lastRenderedPageBreak/>
+        <w:drawing>
+          <wp:inline distT="0" distB="0" distL="0" distR="0" wp14:anchorId="25861B45" wp14:editId="25DF0400">
+            <wp:extent cx="5943600" cy="2192655"/>
+            <wp:effectExtent l="0" t="0" r="0" b="0"/>
+            <wp:docPr id="12" name="Imagen 12"/>
+            <wp:cNvGraphicFramePr>
+              <a:graphicFrameLocks xmlns:a="http://schemas.openxmlformats.org/drawingml/2006/main" noChangeAspect="1"/>
+            </wp:cNvGraphicFramePr>
+            <a:graphic xmlns:a="http://schemas.openxmlformats.org/drawingml/2006/main">
+              <a:graphicData uri="http://schemas.openxmlformats.org/drawingml/2006/picture">
+                <pic:pic xmlns:pic="http://schemas.openxmlformats.org/drawingml/2006/picture">
+                  <pic:nvPicPr>
+                    <pic:cNvPr id="1" name=""/>
+                    <pic:cNvPicPr/>
+                  </pic:nvPicPr>
+                  <pic:blipFill>
+                    <a:blip r:embed="rId20"/>
+                    <a:stretch>
+                      <a:fillRect/>
+                    </a:stretch>
+                  </pic:blipFill>
+                  <pic:spPr>
+                    <a:xfrm>
+                      <a:off x="0" y="0"/>
+                      <a:ext cx="5943600" cy="2192655"/>
+                    </a:xfrm>
+                    <a:prstGeom prst="rect">
+                      <a:avLst/>
+                    </a:prstGeom>
+                  </pic:spPr>
+                </pic:pic>
+              </a:graphicData>
+            </a:graphic>
+          </wp:inline>
+        </w:drawing>
+      </w:r>
+    </w:p>
+    <w:p>
+      <w:pPr>
+        <w:rPr>
+          <w:lang w:val="es-419"/>
+        </w:rPr>
+      </w:pPr>
+      <w:r>
+        <w:rPr>
+          <w:lang w:val="es-419"/>
+        </w:rPr>
+        <w:t>Este es uno de l</w:t>
+      </w:r>
+      <w:r>
+        <w:rPr>
+          <w:lang w:val="es-419"/>
+        </w:rPr>
+        <w:t xml:space="preserve">os pasos mas importantes ya que aquí se </w:t>
+      </w:r>
+      <w:proofErr w:type="gramStart"/>
+      <w:r>
+        <w:rPr>
+          <w:lang w:val="es-419"/>
+        </w:rPr>
+        <w:t>agregara</w:t>
+      </w:r>
+      <w:proofErr w:type="gramEnd"/>
+      <w:r>
+        <w:rPr>
+          <w:lang w:val="es-419"/>
+        </w:rPr>
+        <w:t xml:space="preserve"> la rama fundamental para como dice el nombre el diseño de los patrones</w:t>
+      </w:r>
+    </w:p>
+    <w:p>
+      <w:pPr>
+        <w:rPr>
+          <w:b/>
+          <w:bCs/>
+        </w:rPr>
+      </w:pPr>
+      <w:r>
+        <w:rPr>
+          <w:b/>
+          <w:bCs/>
+        </w:rPr>
+        <w:t>Singleton</w:t>
+      </w:r>
+    </w:p>
+    <w:p>
+      <w:pPr>
+        <w:rPr>
+          <w:b/>
+          <w:bCs/>
+        </w:rPr>
+      </w:pPr>
+      <w:r>
+        <w:rPr>
+          <w:b/>
+          <w:bCs/>
+          <w:noProof/>
+        </w:rPr>
+        <w:drawing>
+          <wp:inline distT="0" distB="0" distL="0" distR="0" wp14:anchorId="06D7F73A" wp14:editId="793DF2DD">
+            <wp:extent cx="5943600" cy="2192655"/>
+            <wp:effectExtent l="0" t="0" r="0" b="0"/>
+            <wp:docPr id="13" name="Imagen 13"/>
+            <wp:cNvGraphicFramePr>
+              <a:graphicFrameLocks xmlns:a="http://schemas.openxmlformats.org/drawingml/2006/main" noChangeAspect="1"/>
+            </wp:cNvGraphicFramePr>
+            <a:graphic xmlns:a="http://schemas.openxmlformats.org/drawingml/2006/main">
+              <a:graphicData uri="http://schemas.openxmlformats.org/drawingml/2006/picture">
+                <pic:pic xmlns:pic="http://schemas.openxmlformats.org/drawingml/2006/picture">
+                  <pic:nvPicPr>
+                    <pic:cNvPr id="1" name=""/>
+                    <pic:cNvPicPr/>
+                  </pic:nvPicPr>
+                  <pic:blipFill>
+                    <a:blip r:embed="rId20"/>
+                    <a:stretch>
+                      <a:fillRect/>
+                    </a:stretch>
+                  </pic:blipFill>
+                  <pic:spPr>
+                    <a:xfrm>
+                      <a:off x="0" y="0"/>
+                      <a:ext cx="5943600" cy="2192655"/>
+                    </a:xfrm>
+                    <a:prstGeom prst="rect">
+                      <a:avLst/>
+                    </a:prstGeom>
+                  </pic:spPr>
+                </pic:pic>
+              </a:graphicData>
+            </a:graphic>
+          </wp:inline>
+        </w:drawing>
+      </w:r>
+    </w:p>
+    <w:p>
+      <w:pPr>
+        <w:rPr>
+          <w:lang w:val="es-419"/>
+        </w:rPr>
+      </w:pPr>
+      <w:r>
+        <w:rPr>
+          <w:lang w:val="es-419"/>
+        </w:rPr>
+        <w:t>Igual el mi</w:t>
+      </w:r>
+      <w:r>
+        <w:rPr>
+          <w:lang w:val="es-419"/>
+        </w:rPr>
+        <w:t>smo sirve para ver la aplicación del patrón que sirve para la gestión de los casos registrados o ingresados</w:t>
+      </w:r>
     </w:p>
     <w:p>
       <w:pPr>
@@ -1622,18 +1821,66 @@
           <w:bCs/>
           <w:lang w:val="es-419"/>
         </w:rPr>
-        <w:t>Singleton</w:t>
+        <w:lastRenderedPageBreak/>
+        <w:t>Observer</w:t>
       </w:r>
       <w:proofErr w:type="spellEnd"/>
-    </w:p>
-    <w:p>
-      <w:pPr>
-        <w:rPr>
-          <w:b/>
-          <w:bCs/>
-          <w:lang w:val="es-419"/>
-        </w:rPr>
-      </w:pPr>
+      <w:r>
+        <w:rPr>
+          <w:b/>
+          <w:bCs/>
+          <w:noProof/>
+          <w:lang w:val="es-419"/>
+        </w:rPr>
+        <w:drawing>
+          <wp:inline distT="0" distB="0" distL="0" distR="0" wp14:anchorId="60915091" wp14:editId="15D19F1C">
+            <wp:extent cx="5943600" cy="3389630"/>
+            <wp:effectExtent l="0" t="0" r="0" b="0"/>
+            <wp:docPr id="14" name="Imagen 14"/>
+            <wp:cNvGraphicFramePr>
+              <a:graphicFrameLocks xmlns:a="http://schemas.openxmlformats.org/drawingml/2006/main" noChangeAspect="1"/>
+            </wp:cNvGraphicFramePr>
+            <a:graphic xmlns:a="http://schemas.openxmlformats.org/drawingml/2006/main">
+              <a:graphicData uri="http://schemas.openxmlformats.org/drawingml/2006/picture">
+                <pic:pic xmlns:pic="http://schemas.openxmlformats.org/drawingml/2006/picture">
+                  <pic:nvPicPr>
+                    <pic:cNvPr id="1" name=""/>
+                    <pic:cNvPicPr/>
+                  </pic:nvPicPr>
+                  <pic:blipFill>
+                    <a:blip r:embed="rId21"/>
+                    <a:stretch>
+                      <a:fillRect/>
+                    </a:stretch>
+                  </pic:blipFill>
+                  <pic:spPr>
+                    <a:xfrm>
+                      <a:off x="0" y="0"/>
+                      <a:ext cx="5943600" cy="3389630"/>
+                    </a:xfrm>
+                    <a:prstGeom prst="rect">
+                      <a:avLst/>
+                    </a:prstGeom>
+                  </pic:spPr>
+                </pic:pic>
+              </a:graphicData>
+            </a:graphic>
+          </wp:inline>
+        </w:drawing>
+      </w:r>
+    </w:p>
+    <w:p>
+      <w:pPr>
+        <w:rPr>
+          <w:lang w:val="es-419"/>
+        </w:rPr>
+      </w:pPr>
+      <w:r>
+        <w:rPr>
+          <w:lang w:val="es-419"/>
+        </w:rPr>
+        <w:t>Esto sirve para las notificaciones sobre los voluntarios registrados.</w:t>
+      </w:r>
     </w:p>
     <w:p>
       <w:pPr>
@@ -1650,15 +1897,7 @@
           <w:bCs/>
           <w:lang w:val="es-419"/>
         </w:rPr>
-        <w:t>Me</w:t>
-      </w:r>
-      <w:r>
-        <w:rPr>
-          <w:b/>
-          <w:bCs/>
-          <w:lang w:val="es-419"/>
-        </w:rPr>
-        <w:t>thod</w:t>
+        <w:t>Method</w:t>
       </w:r>
       <w:proofErr w:type="spellEnd"/>
       <w:r>
@@ -1673,11 +1912,63 @@
     <w:p>
       <w:pPr>
         <w:rPr>
-          <w:b/>
-          <w:bCs/>
-          <w:lang w:val="es-419"/>
-        </w:rPr>
-      </w:pPr>
+          <w:lang w:val="es-419"/>
+        </w:rPr>
+      </w:pPr>
+      <w:r>
+        <w:rPr>
+          <w:noProof/>
+          <w:lang w:val="es-419"/>
+        </w:rPr>
+        <w:drawing>
+          <wp:inline distT="0" distB="0" distL="0" distR="0" wp14:anchorId="4A38DB0B" wp14:editId="4733A932">
+            <wp:extent cx="5943600" cy="1936115"/>
+            <wp:effectExtent l="0" t="0" r="0" b="0"/>
+            <wp:docPr id="15" name="Imagen 15"/>
+            <wp:cNvGraphicFramePr>
+              <a:graphicFrameLocks xmlns:a="http://schemas.openxmlformats.org/drawingml/2006/main" noChangeAspect="1"/>
+            </wp:cNvGraphicFramePr>
+            <a:graphic xmlns:a="http://schemas.openxmlformats.org/drawingml/2006/main">
+              <a:graphicData uri="http://schemas.openxmlformats.org/drawingml/2006/picture">
+                <pic:pic xmlns:pic="http://schemas.openxmlformats.org/drawingml/2006/picture">
+                  <pic:nvPicPr>
+                    <pic:cNvPr id="1" name=""/>
+                    <pic:cNvPicPr/>
+                  </pic:nvPicPr>
+                  <pic:blipFill>
+                    <a:blip r:embed="rId22"/>
+                    <a:stretch>
+                      <a:fillRect/>
+                    </a:stretch>
+                  </pic:blipFill>
+                  <pic:spPr>
+                    <a:xfrm>
+                      <a:off x="0" y="0"/>
+                      <a:ext cx="5943600" cy="1936115"/>
+                    </a:xfrm>
+                    <a:prstGeom prst="rect">
+                      <a:avLst/>
+                    </a:prstGeom>
+                  </pic:spPr>
+                </pic:pic>
+              </a:graphicData>
+            </a:graphic>
+          </wp:inline>
+        </w:drawing>
+      </w:r>
+    </w:p>
+    <w:p>
+      <w:pPr>
+        <w:rPr>
+          <w:lang w:val="es-419"/>
+        </w:rPr>
+      </w:pPr>
+      <w:r>
+        <w:rPr>
+          <w:lang w:val="es-419"/>
+        </w:rPr>
+        <w:t>Este método servirá para los expedientes de las especies</w:t>
+      </w:r>
     </w:p>
     <w:p>
       <w:pPr>
@@ -1699,11 +1990,152 @@
     <w:p>
       <w:pPr>
         <w:rPr>
-          <w:b/>
-          <w:bCs/>
-          <w:lang w:val="es-419"/>
-        </w:rPr>
-      </w:pPr>
+          <w:lang w:val="es-419"/>
+        </w:rPr>
+      </w:pPr>
+      <w:r>
+        <w:rPr>
+          <w:noProof/>
+          <w:lang w:val="es-419"/>
+        </w:rPr>
+        <w:lastRenderedPageBreak/>
+        <w:drawing>
+          <wp:inline distT="0" distB="0" distL="0" distR="0" wp14:anchorId="59DCA571" wp14:editId="7008D4D5">
+            <wp:extent cx="5943600" cy="2157730"/>
+            <wp:effectExtent l="0" t="0" r="0" b="0"/>
+            <wp:docPr id="16" name="Imagen 16"/>
+            <wp:cNvGraphicFramePr>
+              <a:graphicFrameLocks xmlns:a="http://schemas.openxmlformats.org/drawingml/2006/main" noChangeAspect="1"/>
+            </wp:cNvGraphicFramePr>
+            <a:graphic xmlns:a="http://schemas.openxmlformats.org/drawingml/2006/main">
+              <a:graphicData uri="http://schemas.openxmlformats.org/drawingml/2006/picture">
+                <pic:pic xmlns:pic="http://schemas.openxmlformats.org/drawingml/2006/picture">
+                  <pic:nvPicPr>
+                    <pic:cNvPr id="1" name=""/>
+                    <pic:cNvPicPr/>
+                  </pic:nvPicPr>
+                  <pic:blipFill>
+                    <a:blip r:embed="rId23"/>
+                    <a:stretch>
+                      <a:fillRect/>
+                    </a:stretch>
+                  </pic:blipFill>
+                  <pic:spPr>
+                    <a:xfrm>
+                      <a:off x="0" y="0"/>
+                      <a:ext cx="5943600" cy="2157730"/>
+                    </a:xfrm>
+                    <a:prstGeom prst="rect">
+                      <a:avLst/>
+                    </a:prstGeom>
+                  </pic:spPr>
+                </pic:pic>
+              </a:graphicData>
+            </a:graphic>
+          </wp:inline>
+        </w:drawing>
+      </w:r>
+    </w:p>
+    <w:p>
+      <w:pPr>
+        <w:rPr>
+          <w:lang w:val="es-419"/>
+        </w:rPr>
+      </w:pPr>
+      <w:r>
+        <w:rPr>
+          <w:lang w:val="es-419"/>
+        </w:rPr>
+        <w:t>Esto servirá para la aplicación del patrón que se requiere de la actividad.</w:t>
+      </w:r>
+    </w:p>
+    <w:p>
+      <w:pPr>
+        <w:rPr>
+          <w:lang w:val="es-419"/>
+        </w:rPr>
+      </w:pPr>
+      <w:r>
+        <w:rPr>
+          <w:noProof/>
+          <w:lang w:val="es-419"/>
+        </w:rPr>
+        <w:drawing>
+          <wp:inline distT="0" distB="0" distL="0" distR="0" wp14:anchorId="71A56288" wp14:editId="41B58FE6">
+            <wp:extent cx="5943600" cy="2244090"/>
+            <wp:effectExtent l="0" t="0" r="0" b="0"/>
+            <wp:docPr id="17" name="Imagen 17"/>
+            <wp:cNvGraphicFramePr>
+              <a:graphicFrameLocks xmlns:a="http://schemas.openxmlformats.org/drawingml/2006/main" noChangeAspect="1"/>
+            </wp:cNvGraphicFramePr>
+            <a:graphic xmlns:a="http://schemas.openxmlformats.org/drawingml/2006/main">
+              <a:graphicData uri="http://schemas.openxmlformats.org/drawingml/2006/picture">
+                <pic:pic xmlns:pic="http://schemas.openxmlformats.org/drawingml/2006/picture">
+                  <pic:nvPicPr>
+                    <pic:cNvPr id="1" name=""/>
+                    <pic:cNvPicPr/>
+                  </pic:nvPicPr>
+                  <pic:blipFill>
+                    <a:blip r:embed="rId24"/>
+                    <a:stretch>
+                      <a:fillRect/>
+                    </a:stretch>
+                  </pic:blipFill>
+                  <pic:spPr>
+                    <a:xfrm>
+                      <a:off x="0" y="0"/>
+                      <a:ext cx="5943600" cy="2244090"/>
+                    </a:xfrm>
+                    <a:prstGeom prst="rect">
+                      <a:avLst/>
+                    </a:prstGeom>
+                  </pic:spPr>
+                </pic:pic>
+              </a:graphicData>
+            </a:graphic>
+          </wp:inline>
+        </w:drawing>
+      </w:r>
+    </w:p>
+    <w:p>
+      <w:pPr>
+        <w:rPr>
+          <w:lang w:val="es-419"/>
+        </w:rPr>
+      </w:pPr>
+      <w:r>
+        <w:rPr>
+          <w:lang w:val="es-419"/>
+        </w:rPr>
+        <w:t>Aquí ya hicimos el cierre de los patrones de diseño y se hicieron los cambios correctamente sin errores.</w:t>
+      </w:r>
+    </w:p>
+    <w:p>
+      <w:pPr>
+        <w:rPr>
+          <w:b/>
+          <w:bCs/>
+          <w:lang w:val="es-419"/>
+        </w:rPr>
+      </w:pPr>
+      <w:r>
+        <w:rPr>
+          <w:b/>
+          <w:bCs/>
+          <w:lang w:val="es-419"/>
+        </w:rPr>
+        <w:t xml:space="preserve">Diagrama de flujo hecho en </w:t>
+      </w:r>
+      <w:proofErr w:type="spellStart"/>
+      <w:r>
+        <w:rPr>
+          <w:b/>
+          <w:bCs/>
+          <w:lang w:val="es-419"/>
+        </w:rPr>
+        <w:t>LucidChart</w:t>
+      </w:r>
+      <w:proofErr w:type="spellEnd"/>
     </w:p>
     <w:p>
       <w:pPr>

</xml_diff>